<commit_message>
[CUR-1161] URS pipeline cleanup
- Remove compiled URS deliverables and archived source under docs/;
  reproducible from spec/ on demand.
- Remove deployment-overlay content from spec/URS-manifest/
  (cover.md, urs-cover.tex, urs-term-index-cover.tex, frontmatter.md).
- Replace literal values in tools/urs-template.latex and
  tools/build-docx-reference.py with build-time placeholders;
  regenerate tools/urs-reference.docx from the parameterised script.
- Replace literal values in two sponsor_branding.dart doc-comment
  JSON examples with placeholders.

Co-Authored-By: Claude Opus 4.7 (1M context) <noreply@anthropic.com>
</commit_message>
<xml_diff>
--- a/tools/urs-reference.docx
+++ b/tools/urs-reference.docx
@@ -7,9 +7,7 @@
         <w:pStyle w:val="Title"/>
       </w:pPr>
       <w:r>
-        <w:t xml:space="preserve">
-Title
-</w:t>
+        <w:t xml:space="preserve">Title</w:t>
       </w:r>
     </w:p>
     <w:p>
@@ -17,9 +15,7 @@
         <w:pStyle w:val="Subtitle"/>
       </w:pPr>
       <w:r>
-        <w:t xml:space="preserve">
-Subtitle
-</w:t>
+        <w:t xml:space="preserve">Subtitle</w:t>
       </w:r>
     </w:p>
     <w:p>
@@ -27,9 +23,7 @@
         <w:pStyle w:val="Author"/>
       </w:pPr>
       <w:r>
-        <w:t xml:space="preserve">
-Author
-</w:t>
+        <w:t xml:space="preserve">Author</w:t>
       </w:r>
     </w:p>
     <w:p>
@@ -37,20 +31,15 @@
         <w:pStyle w:val="Date"/>
       </w:pPr>
       <w:r>
-        <w:t xml:space="preserve">
-Date
-</w:t>
-      </w:r>
-    </w:p>
-    <w:p>
-      <w:pPr>
-        <w:pStyle w:val="Compact"/>
+        <w:t xml:space="preserve">Date</w:t>
+      </w:r>
+    </w:p>
+    <w:p>
+      <w:pPr>
         <w:pStyle w:val="Abstract"/>
       </w:pPr>
       <w:r>
-        <w:t xml:space="preserve">
-Abstract
-</w:t>
+        <w:t xml:space="preserve">Abstract</w:t>
       </w:r>
     </w:p>
     <w:p>
@@ -59,9 +48,7 @@
       </w:pPr>
       <w:bookmarkStart w:id="21" w:name="heading-1"/>
       <w:r>
-        <w:t xml:space="preserve">
-Heading 1
-</w:t>
+        <w:t xml:space="preserve">Heading 1</w:t>
       </w:r>
       <w:bookmarkEnd w:id="21"/>
     </w:p>
@@ -71,9 +58,7 @@
       </w:pPr>
       <w:bookmarkStart w:id="22" w:name="heading-2"/>
       <w:r>
-        <w:t xml:space="preserve">
-Heading 2
-</w:t>
+        <w:t xml:space="preserve">Heading 2</w:t>
       </w:r>
       <w:bookmarkEnd w:id="22"/>
     </w:p>
@@ -83,9 +68,7 @@
       </w:pPr>
       <w:bookmarkStart w:id="23" w:name="heading-3"/>
       <w:r>
-        <w:t xml:space="preserve">
-Heading 3
-</w:t>
+        <w:t xml:space="preserve">Heading 3</w:t>
       </w:r>
       <w:bookmarkEnd w:id="23"/>
     </w:p>
@@ -95,9 +78,7 @@
       </w:pPr>
       <w:bookmarkStart w:id="24" w:name="heading-4"/>
       <w:r>
-        <w:t xml:space="preserve">
-Heading 4
-</w:t>
+        <w:t xml:space="preserve">Heading 4</w:t>
       </w:r>
       <w:bookmarkEnd w:id="24"/>
     </w:p>
@@ -107,9 +88,7 @@
       </w:pPr>
       <w:bookmarkStart w:id="25" w:name="heading-5"/>
       <w:r>
-        <w:t xml:space="preserve">
-Heading 5
-</w:t>
+        <w:t xml:space="preserve">Heading 5</w:t>
       </w:r>
       <w:bookmarkEnd w:id="25"/>
     </w:p>
@@ -119,9 +98,7 @@
       </w:pPr>
       <w:bookmarkStart w:id="26" w:name="heading-6"/>
       <w:r>
-        <w:t xml:space="preserve">
-Heading 6
-</w:t>
+        <w:t xml:space="preserve">Heading 6</w:t>
       </w:r>
       <w:bookmarkEnd w:id="26"/>
     </w:p>
@@ -131,9 +108,7 @@
       </w:pPr>
       <w:bookmarkStart w:id="27" w:name="heading-7"/>
       <w:r>
-        <w:t xml:space="preserve">
-Heading 7
-</w:t>
+        <w:t xml:space="preserve">Heading 7</w:t>
       </w:r>
       <w:bookmarkEnd w:id="27"/>
     </w:p>
@@ -143,9 +118,7 @@
       </w:pPr>
       <w:bookmarkStart w:id="28" w:name="heading-8"/>
       <w:r>
-        <w:t xml:space="preserve">
-Heading 8
-</w:t>
+        <w:t xml:space="preserve">Heading 8</w:t>
       </w:r>
       <w:bookmarkEnd w:id="28"/>
     </w:p>
@@ -155,9 +128,7 @@
       </w:pPr>
       <w:bookmarkStart w:id="29" w:name="heading-9"/>
       <w:r>
-        <w:t xml:space="preserve">
-Heading 9
-</w:t>
+        <w:t xml:space="preserve">Heading 9</w:t>
       </w:r>
       <w:bookmarkEnd w:id="29"/>
     </w:p>
@@ -166,9 +137,7 @@
         <w:pStyle w:val="FirstParagraph"/>
       </w:pPr>
       <w:r>
-        <w:t xml:space="preserve">
-First Paragraph.
-</w:t>
+        <w:t xml:space="preserve">First Paragraph.</w:t>
       </w:r>
     </w:p>
     <w:p>
@@ -176,54 +145,39 @@
         <w:pStyle w:val="BodyText"/>
       </w:pPr>
       <w:r>
-        <w:t xml:space="preserve">
-Body Text. Body Text Char.
-</w:t>
-      </w:r>
-      <w:r>
-        <w:t xml:space="preserve">
-</w:t>
+        <w:t xml:space="preserve">Body Text. Body Text Char.</w:t>
+      </w:r>
+      <w:r>
+        <w:t xml:space="preserve"> </w:t>
       </w:r>
       <w:r>
         <w:rPr>
           <w:rStyle w:val="VerbatimChar"/>
         </w:rPr>
-        <w:t xml:space="preserve">
-Verbatim Char
-</w:t>
-      </w:r>
-      <w:r>
-        <w:t xml:space="preserve">
-.
-</w:t>
-      </w:r>
-      <w:r>
-        <w:t xml:space="preserve">
-</w:t>
+        <w:t xml:space="preserve">Verbatim Char</w:t>
+      </w:r>
+      <w:r>
+        <w:t xml:space="preserve">.</w:t>
+      </w:r>
+      <w:r>
+        <w:t xml:space="preserve"> </w:t>
       </w:r>
       <w:hyperlink r:id="rId30">
         <w:r>
           <w:rPr>
             <w:rStyle w:val="Hyperlink"/>
           </w:rPr>
-          <w:t xml:space="preserve">
-Hyperlink
-</w:t>
+          <w:t xml:space="preserve">Hyperlink</w:t>
         </w:r>
       </w:hyperlink>
       <w:r>
-        <w:t xml:space="preserve">
-.
-</w:t>
-      </w:r>
-      <w:r>
-        <w:t xml:space="preserve">
-</w:t>
-      </w:r>
-      <w:r>
-        <w:t xml:space="preserve">
-Footnote.
-</w:t>
+        <w:t xml:space="preserve">.</w:t>
+      </w:r>
+      <w:r>
+        <w:t xml:space="preserve"> </w:t>
+      </w:r>
+      <w:r>
+        <w:t xml:space="preserve">Footnote.</w:t>
       </w:r>
       <w:r>
         <w:rPr>
@@ -237,9 +191,7 @@
         <w:pStyle w:val="BlockText"/>
       </w:pPr>
       <w:r>
-        <w:t xml:space="preserve">
-Block Text.
-</w:t>
+        <w:t xml:space="preserve">Block Text.</w:t>
       </w:r>
     </w:p>
     <w:p>
@@ -247,22 +199,19 @@
         <w:pStyle w:val="TableCaption"/>
       </w:pPr>
       <w:r>
-        <w:t xml:space="preserve">
-Table caption.
-</w:t>
+        <w:t xml:space="preserve">Table caption.</w:t>
       </w:r>
     </w:p>
     <w:tbl>
       <w:tblPr>
         <w:tblStyle w:val="Table"/>
-        <w:tblW w:type="pct" w:w="0.0"/>
         <w:tblLook w:firstRow="1"/>
         <w:tblCaption w:val="Table caption."/>
       </w:tblPr>
       <w:tblGrid/>
       <w:tr>
         <w:trPr>
-          <w:cnfStyle w:firstRow="1"/>
+          <w:cnfStyle w:firstRow="1" w:val="100000000000"/>
         </w:trPr>
         <w:tc>
           <w:tcPr>
@@ -277,9 +226,7 @@
               <w:jc w:val="left"/>
             </w:pPr>
             <w:r>
-              <w:t xml:space="preserve">
-Table
-</w:t>
+              <w:t xml:space="preserve">Table</w:t>
             </w:r>
           </w:p>
         </w:tc>
@@ -296,9 +243,7 @@
               <w:jc w:val="left"/>
             </w:pPr>
             <w:r>
-              <w:t xml:space="preserve">
-Table
-</w:t>
+              <w:t xml:space="preserve">Table</w:t>
             </w:r>
           </w:p>
         </w:tc>
@@ -311,9 +256,7 @@
               <w:jc w:val="left"/>
             </w:pPr>
             <w:r>
-              <w:t xml:space="preserve">
-1
-</w:t>
+              <w:t xml:space="preserve">1</w:t>
             </w:r>
           </w:p>
         </w:tc>
@@ -324,9 +267,7 @@
               <w:jc w:val="left"/>
             </w:pPr>
             <w:r>
-              <w:t xml:space="preserve">
-2
-</w:t>
+              <w:t xml:space="preserve">2</w:t>
             </w:r>
           </w:p>
         </w:tc>
@@ -337,9 +278,7 @@
         <w:pStyle w:val="ImageCaption"/>
       </w:pPr>
       <w:r>
-        <w:t xml:space="preserve">
-Image Caption
-</w:t>
+        <w:t xml:space="preserve">Image Caption</w:t>
       </w:r>
     </w:p>
     <w:p>
@@ -347,9 +286,7 @@
         <w:pStyle w:val="DefinitionTerm"/>
       </w:pPr>
       <w:r>
-        <w:t xml:space="preserve">
-DefinitionTerm
-</w:t>
+        <w:t xml:space="preserve">DefinitionTerm</w:t>
       </w:r>
     </w:p>
     <w:p>
@@ -357,9 +294,7 @@
         <w:pStyle w:val="Definition"/>
       </w:pPr>
       <w:r>
-        <w:t xml:space="preserve">
-Definition
-</w:t>
+        <w:t xml:space="preserve">Definition</w:t>
       </w:r>
     </w:p>
     <w:p>
@@ -367,9 +302,7 @@
         <w:pStyle w:val="DefinitionTerm"/>
       </w:pPr>
       <w:r>
-        <w:t xml:space="preserve">
-DefinitionTerm
-</w:t>
+        <w:t xml:space="preserve">DefinitionTerm</w:t>
       </w:r>
     </w:p>
     <w:p>
@@ -377,14 +310,15 @@
         <w:pStyle w:val="Definition"/>
       </w:pPr>
       <w:r>
-        <w:t xml:space="preserve">
-Definition
-</w:t>
+        <w:t xml:space="preserve">Definition</w:t>
       </w:r>
     </w:p>
     <w:sectPr>
       <w:headerReference w:type="default" r:id="rId9"/>
       <w:footerReference w:type="default" r:id="rId10"/>
+      <w:footnotePr>
+        <w:numRestart w:val="eachSect"/>
+      </w:footnotePr>
     </w:sectPr>
   </w:body>
 </w:document>
@@ -419,7 +353,7 @@
             <w:rPr>
               <w:sz w:val="18"/>
             </w:rPr>
-            <w:t>Specific to Protocol TER-4480-C01</w:t>
+            <w:t>Specific to Protocol [PROTOCOL]</w:t>
           </w:r>
         </w:p>
       </w:tc>
@@ -508,10 +442,15 @@
         <w:footnoteRef/>
       </w:r>
       <w:r>
-        <w:t xml:space="preserve"> </w:t>
-      </w:r>
-      <w:r>
-        <w:t xml:space="preserve">Footnote Text.</w:t>
+        <w:t>Footnote Text.</w:t>
+      </w:r>
+    </w:p>
+    <w:p>
+      <w:pPr>
+        <w:pStyle w:val="FootnoteBlockText"/>
+      </w:pPr>
+      <w:r>
+        <w:t>Footnote Block Text</w:t>
       </w:r>
     </w:p>
   </w:footnote>
@@ -542,7 +481,7 @@
         <w:rFonts w:ascii="Arial" w:hAnsi="Arial"/>
         <w:sz w:val="18"/>
       </w:rPr>
-      <w:t>Sponsor: Terremoto Biosciences</w:t>
+      <w:t>Sponsor: [SPONSOR_NAME]</w:t>
     </w:r>
   </w:p>
   <w:p>
@@ -554,7 +493,7 @@
         <w:rFonts w:ascii="Arial" w:hAnsi="Arial"/>
         <w:sz w:val="18"/>
       </w:rPr>
-      <w:t>Protocol: TER-4480-C01    Version: 1.0</w:t>
+      <w:t>Protocol: [PROTOCOL]    Version: 1.0</w:t>
     </w:r>
   </w:p>
 </w:hdr>
@@ -676,10 +615,10 @@
   <w:docDefaults>
     <w:rPrDefault>
       <w:rPr>
-        <w:rFonts w:asciiTheme="minorHAnsi" w:eastAsiaTheme="minorHAnsi" w:hAnsiTheme="minorHAnsi" w:cstheme="minorBidi"/>
+        <w:rFonts w:asciiTheme="minorHAnsi" w:eastAsiaTheme="minorEastAsia" w:hAnsiTheme="minorHAnsi" w:cstheme="minorBidi"/>
         <w:sz w:val="24"/>
         <w:szCs w:val="24"/>
-        <w:lang w:val="en-US" w:eastAsia="en-US" w:bidi="ar-SA"/>
+        <w:lang w:val="en-US" w:eastAsia="zh-CN" w:bidi="ar-SA"/>
       </w:rPr>
     </w:rPrDefault>
     <w:pPrDefault>
@@ -704,10 +643,10 @@
     <w:name w:val="Body Text"/>
     <w:basedOn w:val="Normal"/>
     <w:link w:val="BodyTextChar"/>
+    <w:qFormat/>
     <w:pPr>
       <w:spacing w:before="180" w:after="180"/>
     </w:pPr>
-    <w:qFormat/>
   </w:style>
   <w:style w:type="paragraph" w:customStyle="1" w:styleId="FirstParagraph">
     <w:name w:val="First Paragraph"/>
@@ -727,57 +666,113 @@
     <w:name w:val="Title"/>
     <w:basedOn w:val="Normal"/>
     <w:next w:val="BodyText"/>
-    <w:qFormat/>
-    <w:pPr>
-      <w:keepNext/>
-      <w:keepLines/>
-      <w:spacing w:before="480" w:after="480"/>
+    <w:link w:val="TitleChar"/>
+    <w:uiPriority w:val="10"/>
+    <w:qFormat/>
+    <w:rsid w:val="00A10FD9"/>
+    <w:pPr>
+      <w:spacing w:after="480" w:line="240" w:lineRule="auto"/>
+      <w:contextualSpacing/>
       <w:jc w:val="center"/>
     </w:pPr>
     <w:rPr>
       <w:rFonts w:asciiTheme="majorHAnsi" w:eastAsiaTheme="majorEastAsia" w:hAnsiTheme="majorHAnsi" w:cstheme="majorBidi" w:ascii="Arial" w:hAnsi="Arial"/>
       <w:b/>
-      <w:bCs/>
       <w:color w:val="1F3A5F"/>
       <w:sz w:val="48"/>
-      <w:szCs w:val="36"/>
+      <w:szCs w:val="56"/>
+    </w:rPr>
+  </w:style>
+  <w:style w:type="character" w:customStyle="1" w:styleId="TitleChar">
+    <w:name w:val="Title Char"/>
+    <w:basedOn w:val="DefaultParagraphFont"/>
+    <w:link w:val="Title"/>
+    <w:uiPriority w:val="10"/>
+    <w:rsid w:val="00A10FD9"/>
+    <w:rPr>
+      <w:rFonts w:asciiTheme="majorHAnsi" w:eastAsiaTheme="majorEastAsia" w:hAnsiTheme="majorHAnsi" w:cstheme="majorBidi"/>
+      <w:sz w:val="56"/>
+      <w:szCs w:val="56"/>
     </w:rPr>
   </w:style>
   <w:style w:type="paragraph" w:styleId="Subtitle">
     <w:name w:val="Subtitle"/>
     <w:basedOn w:val="Title"/>
     <w:next w:val="BodyText"/>
+    <w:link w:val="SubtitleChar"/>
+    <w:uiPriority w:val="11"/>
+    <w:qFormat/>
+    <w:rsid w:val="00A10FD9"/>
+    <w:pPr>
+      <w:numPr>
+        <w:ilvl w:val="1"/>
+      </w:numPr>
+    </w:pPr>
+    <w:rPr>
+      <w:rFonts w:eastAsiaTheme="majorEastAsia" w:cstheme="majorBidi"/>
+      <w:spacing w:val="15"/>
+      <w:sz w:val="28"/>
+      <w:szCs w:val="28"/>
+    </w:rPr>
+  </w:style>
+  <w:style w:type="character" w:customStyle="1" w:styleId="SubtitleChar">
+    <w:name w:val="Subtitle Char"/>
+    <w:basedOn w:val="DefaultParagraphFont"/>
+    <w:link w:val="Subtitle"/>
+    <w:uiPriority w:val="11"/>
+    <w:rsid w:val="00A10FD9"/>
+    <w:rPr>
+      <w:rFonts w:eastAsiaTheme="majorEastAsia" w:cstheme="majorBidi"/>
+      <w:color w:val="595959" w:themeColor="text1" w:themeTint="A6"/>
+      <w:spacing w:val="15"/>
+      <w:sz w:val="28"/>
+      <w:szCs w:val="28"/>
+    </w:rPr>
+  </w:style>
+  <w:style w:type="paragraph" w:customStyle="1" w:styleId="Author">
+    <w:name w:val="Author"/>
+    <w:basedOn w:val="Title"/>
+    <w:next w:val="BodyText"/>
     <w:qFormat/>
     <w:pPr>
       <w:keepNext/>
       <w:keepLines/>
-      <w:spacing w:before="240" w:after="240"/>
-      <w:jc w:val="center"/>
-    </w:pPr>
-    <w:rPr>
-      <w:sz w:val="30"/>
-      <w:szCs w:val="30"/>
-    </w:rPr>
-  </w:style>
-  <w:style w:type="paragraph" w:customStyle="1" w:styleId="Author">
-    <w:name w:val="Author"/>
+    </w:pPr>
+    <w:rPr>
+      <w:sz w:val="24"/>
+      <w:szCs w:val="24"/>
+    </w:rPr>
+  </w:style>
+  <w:style w:type="paragraph" w:styleId="Date">
+    <w:name w:val="Date"/>
+    <w:basedOn w:val="Title"/>
     <w:next w:val="BodyText"/>
     <w:qFormat/>
     <w:pPr>
       <w:keepNext/>
       <w:keepLines/>
-      <w:jc w:val="center"/>
-    </w:pPr>
-  </w:style>
-  <w:style w:type="paragraph" w:styleId="Date">
-    <w:name w:val="Date"/>
-    <w:next w:val="BodyText"/>
+    </w:pPr>
+    <w:rPr>
+      <w:sz w:val="24"/>
+      <w:szCs w:val="24"/>
+    </w:rPr>
+  </w:style>
+  <w:style w:type="paragraph" w:customStyle="1" w:styleId="AbstractTitle">
+    <w:name w:val="Abstract Title"/>
+    <w:basedOn w:val="Normal"/>
+    <w:next w:val="Abstract"/>
     <w:qFormat/>
     <w:pPr>
       <w:keepNext/>
       <w:keepLines/>
+      <w:spacing w:before="300" w:after="0"/>
       <w:jc w:val="center"/>
     </w:pPr>
+    <w:rPr>
+      <w:b/>
+      <w:sz w:val="20"/>
+      <w:szCs w:val="20"/>
+    </w:rPr>
   </w:style>
   <w:style w:type="paragraph" w:customStyle="1" w:styleId="Abstract">
     <w:name w:val="Abstract"/>
@@ -787,7 +782,7 @@
     <w:pPr>
       <w:keepNext/>
       <w:keepLines/>
-      <w:spacing w:before="300" w:after="300"/>
+      <w:spacing w:before="100" w:after="300"/>
     </w:pPr>
     <w:rPr>
       <w:sz w:val="20"/>
@@ -803,11 +798,13 @@
     <w:rPr/>
   </w:style>
   <w:style w:type="paragraph" w:styleId="Heading1">
-    <w:name w:val="Heading 1"/>
-    <w:basedOn w:val="Normal"/>
-    <w:next w:val="BodyText"/>
-    <w:uiPriority w:val="9"/>
-    <w:qFormat/>
+    <w:name w:val="heading 1"/>
+    <w:basedOn w:val="Normal"/>
+    <w:next w:val="BodyText"/>
+    <w:link w:val="Heading1Char"/>
+    <w:uiPriority w:val="9"/>
+    <w:qFormat/>
+    <w:rsid w:val="00A10FD9"/>
     <w:pPr>
       <w:keepNext/>
       <w:keepLines/>
@@ -818,20 +815,22 @@
     <w:rPr>
       <w:rFonts w:asciiTheme="majorHAnsi" w:eastAsiaTheme="majorEastAsia" w:hAnsiTheme="majorHAnsi" w:cstheme="majorBidi" w:ascii="Arial" w:hAnsi="Arial"/>
       <w:b/>
-      <w:bCs/>
       <w:i w:val="0"/>
       <w:color w:val="1F3A5F"/>
       <w:sz w:val="36"/>
-      <w:szCs w:val="32"/>
+      <w:szCs w:val="40"/>
     </w:rPr>
   </w:style>
   <w:style w:type="paragraph" w:styleId="Heading2">
-    <w:name w:val="Heading 2"/>
-    <w:basedOn w:val="Normal"/>
-    <w:next w:val="BodyText"/>
-    <w:uiPriority w:val="9"/>
+    <w:name w:val="heading 2"/>
+    <w:basedOn w:val="Normal"/>
+    <w:next w:val="BodyText"/>
+    <w:link w:val="Heading2Char"/>
+    <w:uiPriority w:val="9"/>
+    <w:semiHidden/>
     <w:unhideWhenUsed/>
     <w:qFormat/>
+    <w:rsid w:val="00A10FD9"/>
     <w:pPr>
       <w:keepNext/>
       <w:keepLines/>
@@ -841,20 +840,22 @@
     <w:rPr>
       <w:rFonts w:asciiTheme="majorHAnsi" w:eastAsiaTheme="majorEastAsia" w:hAnsiTheme="majorHAnsi" w:cstheme="majorBidi" w:ascii="Arial" w:hAnsi="Arial"/>
       <w:b/>
-      <w:bCs/>
       <w:i w:val="0"/>
       <w:color w:val="1F3A5F"/>
       <w:sz w:val="28"/>
-      <w:szCs w:val="28"/>
+      <w:szCs w:val="32"/>
     </w:rPr>
   </w:style>
   <w:style w:type="paragraph" w:styleId="Heading3">
-    <w:name w:val="Heading 3"/>
-    <w:basedOn w:val="Normal"/>
-    <w:next w:val="BodyText"/>
-    <w:uiPriority w:val="9"/>
+    <w:name w:val="heading 3"/>
+    <w:basedOn w:val="Normal"/>
+    <w:next w:val="BodyText"/>
+    <w:link w:val="Heading3Char"/>
+    <w:uiPriority w:val="9"/>
+    <w:semiHidden/>
     <w:unhideWhenUsed/>
     <w:qFormat/>
+    <w:rsid w:val="00A10FD9"/>
     <w:pPr>
       <w:keepNext/>
       <w:keepLines/>
@@ -862,22 +863,24 @@
       <w:outlineLvl w:val="2"/>
     </w:pPr>
     <w:rPr>
-      <w:rFonts w:asciiTheme="majorHAnsi" w:eastAsiaTheme="majorEastAsia" w:hAnsiTheme="majorHAnsi" w:cstheme="majorBidi" w:ascii="Arial" w:hAnsi="Arial"/>
+      <w:rFonts w:eastAsiaTheme="majorEastAsia" w:cstheme="majorBidi" w:ascii="Arial" w:hAnsi="Arial"/>
       <w:b/>
-      <w:bCs/>
       <w:i w:val="0"/>
       <w:color w:val="1F3A5F"/>
       <w:sz w:val="24"/>
-      <w:szCs w:val="24"/>
+      <w:szCs w:val="28"/>
     </w:rPr>
   </w:style>
   <w:style w:type="paragraph" w:styleId="Heading4">
-    <w:name w:val="Heading 4"/>
-    <w:basedOn w:val="Normal"/>
-    <w:next w:val="BodyText"/>
-    <w:uiPriority w:val="9"/>
+    <w:name w:val="heading 4"/>
+    <w:basedOn w:val="Normal"/>
+    <w:next w:val="BodyText"/>
+    <w:link w:val="Heading4Char"/>
+    <w:uiPriority w:val="9"/>
+    <w:semiHidden/>
     <w:unhideWhenUsed/>
     <w:qFormat/>
+    <w:rsid w:val="00A10FD9"/>
     <w:pPr>
       <w:keepNext/>
       <w:keepLines/>
@@ -885,22 +888,24 @@
       <w:outlineLvl w:val="3"/>
     </w:pPr>
     <w:rPr>
-      <w:rFonts w:asciiTheme="majorHAnsi" w:eastAsiaTheme="majorEastAsia" w:hAnsiTheme="majorHAnsi" w:cstheme="majorBidi" w:ascii="Arial" w:hAnsi="Arial"/>
+      <w:rFonts w:eastAsiaTheme="majorEastAsia" w:cstheme="majorBidi" w:ascii="Arial" w:hAnsi="Arial"/>
+      <w:b/>
       <w:i/>
-      <w:b/>
-      <w:bCs/>
+      <w:iCs/>
       <w:color w:val="1F3A5F"/>
       <w:sz w:val="22"/>
-      <w:szCs w:val="24"/>
     </w:rPr>
   </w:style>
   <w:style w:type="paragraph" w:styleId="Heading5">
-    <w:name w:val="Heading 5"/>
-    <w:basedOn w:val="Normal"/>
-    <w:next w:val="BodyText"/>
-    <w:uiPriority w:val="9"/>
+    <w:name w:val="heading 5"/>
+    <w:basedOn w:val="Normal"/>
+    <w:next w:val="BodyText"/>
+    <w:link w:val="Heading5Char"/>
+    <w:uiPriority w:val="9"/>
+    <w:semiHidden/>
     <w:unhideWhenUsed/>
     <w:qFormat/>
+    <w:rsid w:val="00A10FD9"/>
     <w:pPr>
       <w:keepNext/>
       <w:keepLines/>
@@ -908,93 +913,218 @@
       <w:outlineLvl w:val="4"/>
     </w:pPr>
     <w:rPr>
-      <w:rFonts w:asciiTheme="majorHAnsi" w:eastAsiaTheme="majorEastAsia" w:hAnsiTheme="majorHAnsi" w:cstheme="majorBidi" w:ascii="Arial" w:hAnsi="Arial"/>
+      <w:rFonts w:eastAsiaTheme="majorEastAsia" w:cstheme="majorBidi" w:ascii="Arial" w:hAnsi="Arial"/>
       <w:b w:val="0"/>
       <w:i/>
-      <w:iCs/>
       <w:color w:val="404040"/>
       <w:sz w:val="22"/>
-      <w:szCs w:val="24"/>
     </w:rPr>
   </w:style>
   <w:style w:type="paragraph" w:styleId="Heading6">
-    <w:name w:val="Heading 6"/>
-    <w:basedOn w:val="Normal"/>
-    <w:next w:val="BodyText"/>
-    <w:uiPriority w:val="9"/>
+    <w:name w:val="heading 6"/>
+    <w:basedOn w:val="Normal"/>
+    <w:next w:val="BodyText"/>
+    <w:link w:val="Heading6Char"/>
+    <w:uiPriority w:val="9"/>
+    <w:semiHidden/>
     <w:unhideWhenUsed/>
     <w:qFormat/>
+    <w:rsid w:val="00A10FD9"/>
     <w:pPr>
       <w:keepNext/>
       <w:keepLines/>
-      <w:spacing w:before="200" w:after="0"/>
+      <w:spacing w:before="40" w:after="0"/>
       <w:outlineLvl w:val="5"/>
     </w:pPr>
     <w:rPr>
-      <w:rFonts w:asciiTheme="majorHAnsi" w:eastAsiaTheme="majorEastAsia" w:hAnsiTheme="majorHAnsi" w:cstheme="majorBidi"/>
-      <w:color w:val="4F81BD" w:themeColor="accent1"/>
-      <w:sz w:val="24"/>
-      <w:szCs w:val="24"/>
+      <w:rFonts w:eastAsiaTheme="majorEastAsia" w:cstheme="majorBidi"/>
+      <w:i/>
+      <w:iCs/>
+      <w:color w:val="595959" w:themeColor="text1" w:themeTint="A6"/>
     </w:rPr>
   </w:style>
   <w:style w:type="paragraph" w:styleId="Heading7">
-    <w:name w:val="Heading 7"/>
-    <w:basedOn w:val="Normal"/>
-    <w:next w:val="BodyText"/>
-    <w:uiPriority w:val="9"/>
+    <w:name w:val="heading 7"/>
+    <w:basedOn w:val="Normal"/>
+    <w:next w:val="BodyText"/>
+    <w:link w:val="Heading7Char"/>
+    <w:uiPriority w:val="9"/>
+    <w:semiHidden/>
     <w:unhideWhenUsed/>
     <w:qFormat/>
+    <w:rsid w:val="00A10FD9"/>
     <w:pPr>
       <w:keepNext/>
       <w:keepLines/>
-      <w:spacing w:before="200" w:after="0"/>
+      <w:spacing w:before="40" w:after="0"/>
       <w:outlineLvl w:val="6"/>
     </w:pPr>
     <w:rPr>
-      <w:rFonts w:asciiTheme="majorHAnsi" w:eastAsiaTheme="majorEastAsia" w:hAnsiTheme="majorHAnsi" w:cstheme="majorBidi"/>
-      <w:color w:val="4F81BD" w:themeColor="accent1"/>
-      <w:sz w:val="24"/>
-      <w:szCs w:val="24"/>
+      <w:rFonts w:eastAsiaTheme="majorEastAsia" w:cstheme="majorBidi"/>
+      <w:color w:val="595959" w:themeColor="text1" w:themeTint="A6"/>
     </w:rPr>
   </w:style>
   <w:style w:type="paragraph" w:styleId="Heading8">
-    <w:name w:val="Heading 8"/>
-    <w:basedOn w:val="Normal"/>
-    <w:next w:val="BodyText"/>
-    <w:uiPriority w:val="9"/>
+    <w:name w:val="heading 8"/>
+    <w:basedOn w:val="Normal"/>
+    <w:next w:val="BodyText"/>
+    <w:link w:val="Heading8Char"/>
+    <w:uiPriority w:val="9"/>
+    <w:semiHidden/>
     <w:unhideWhenUsed/>
     <w:qFormat/>
+    <w:rsid w:val="00A10FD9"/>
     <w:pPr>
       <w:keepNext/>
       <w:keepLines/>
-      <w:spacing w:before="200" w:after="0"/>
+      <w:spacing w:after="0"/>
       <w:outlineLvl w:val="7"/>
     </w:pPr>
     <w:rPr>
-      <w:rFonts w:asciiTheme="majorHAnsi" w:eastAsiaTheme="majorEastAsia" w:hAnsiTheme="majorHAnsi" w:cstheme="majorBidi"/>
-      <w:color w:val="4F81BD" w:themeColor="accent1"/>
-      <w:sz w:val="24"/>
-      <w:szCs w:val="24"/>
+      <w:rFonts w:eastAsiaTheme="majorEastAsia" w:cstheme="majorBidi"/>
+      <w:i/>
+      <w:iCs/>
+      <w:color w:val="272727" w:themeColor="text1" w:themeTint="D8"/>
     </w:rPr>
   </w:style>
   <w:style w:type="paragraph" w:styleId="Heading9">
-    <w:name w:val="Heading 9"/>
-    <w:basedOn w:val="Normal"/>
-    <w:next w:val="BodyText"/>
-    <w:uiPriority w:val="9"/>
+    <w:name w:val="heading 9"/>
+    <w:basedOn w:val="Normal"/>
+    <w:next w:val="BodyText"/>
+    <w:link w:val="Heading9Char"/>
+    <w:uiPriority w:val="9"/>
+    <w:semiHidden/>
     <w:unhideWhenUsed/>
     <w:qFormat/>
+    <w:rsid w:val="00A10FD9"/>
     <w:pPr>
       <w:keepNext/>
       <w:keepLines/>
-      <w:spacing w:before="200" w:after="0"/>
+      <w:spacing w:after="0"/>
       <w:outlineLvl w:val="8"/>
     </w:pPr>
     <w:rPr>
+      <w:rFonts w:eastAsiaTheme="majorEastAsia" w:cstheme="majorBidi"/>
+      <w:color w:val="272727" w:themeColor="text1" w:themeTint="D8"/>
+    </w:rPr>
+  </w:style>
+  <w:style w:type="character" w:customStyle="1" w:styleId="Heading1Char">
+    <w:name w:val="Heading 1 Char"/>
+    <w:basedOn w:val="DefaultParagraphFont"/>
+    <w:link w:val="Heading1"/>
+    <w:uiPriority w:val="9"/>
+    <w:rsid w:val="00A10FD9"/>
+    <w:rPr>
       <w:rFonts w:asciiTheme="majorHAnsi" w:eastAsiaTheme="majorEastAsia" w:hAnsiTheme="majorHAnsi" w:cstheme="majorBidi"/>
-      <w:color w:val="4F81BD" w:themeColor="accent1"/>
-      <w:sz w:val="24"/>
-      <w:szCs w:val="24"/>
+      <w:color w:val="0F4761" w:themeColor="accent1" w:themeShade="BF"/>
+      <w:sz w:val="40"/>
+      <w:szCs w:val="40"/>
+    </w:rPr>
+  </w:style>
+  <w:style w:type="character" w:customStyle="1" w:styleId="Heading2Char">
+    <w:name w:val="Heading 2 Char"/>
+    <w:basedOn w:val="DefaultParagraphFont"/>
+    <w:link w:val="Heading2"/>
+    <w:uiPriority w:val="9"/>
+    <w:semiHidden/>
+    <w:rsid w:val="00A10FD9"/>
+    <w:rPr>
+      <w:rFonts w:asciiTheme="majorHAnsi" w:eastAsiaTheme="majorEastAsia" w:hAnsiTheme="majorHAnsi" w:cstheme="majorBidi"/>
+      <w:color w:val="0F4761" w:themeColor="accent1" w:themeShade="BF"/>
+      <w:sz w:val="32"/>
+      <w:szCs w:val="32"/>
+    </w:rPr>
+  </w:style>
+  <w:style w:type="character" w:customStyle="1" w:styleId="Heading3Char">
+    <w:name w:val="Heading 3 Char"/>
+    <w:basedOn w:val="DefaultParagraphFont"/>
+    <w:link w:val="Heading3"/>
+    <w:uiPriority w:val="9"/>
+    <w:semiHidden/>
+    <w:rsid w:val="00A10FD9"/>
+    <w:rPr>
+      <w:rFonts w:eastAsiaTheme="majorEastAsia" w:cstheme="majorBidi"/>
+      <w:color w:val="0F4761" w:themeColor="accent1" w:themeShade="BF"/>
+      <w:sz w:val="28"/>
+      <w:szCs w:val="28"/>
+    </w:rPr>
+  </w:style>
+  <w:style w:type="character" w:customStyle="1" w:styleId="Heading4Char">
+    <w:name w:val="Heading 4 Char"/>
+    <w:basedOn w:val="DefaultParagraphFont"/>
+    <w:link w:val="Heading4"/>
+    <w:uiPriority w:val="9"/>
+    <w:semiHidden/>
+    <w:rsid w:val="00A10FD9"/>
+    <w:rPr>
+      <w:rFonts w:eastAsiaTheme="majorEastAsia" w:cstheme="majorBidi"/>
+      <w:i/>
+      <w:iCs/>
+      <w:color w:val="0F4761" w:themeColor="accent1" w:themeShade="BF"/>
+    </w:rPr>
+  </w:style>
+  <w:style w:type="character" w:customStyle="1" w:styleId="Heading5Char">
+    <w:name w:val="Heading 5 Char"/>
+    <w:basedOn w:val="DefaultParagraphFont"/>
+    <w:link w:val="Heading5"/>
+    <w:uiPriority w:val="9"/>
+    <w:semiHidden/>
+    <w:rsid w:val="00A10FD9"/>
+    <w:rPr>
+      <w:rFonts w:eastAsiaTheme="majorEastAsia" w:cstheme="majorBidi"/>
+      <w:color w:val="0F4761" w:themeColor="accent1" w:themeShade="BF"/>
+    </w:rPr>
+  </w:style>
+  <w:style w:type="character" w:customStyle="1" w:styleId="Heading6Char">
+    <w:name w:val="Heading 6 Char"/>
+    <w:basedOn w:val="DefaultParagraphFont"/>
+    <w:link w:val="Heading6"/>
+    <w:uiPriority w:val="9"/>
+    <w:semiHidden/>
+    <w:rsid w:val="00A10FD9"/>
+    <w:rPr>
+      <w:rFonts w:eastAsiaTheme="majorEastAsia" w:cstheme="majorBidi"/>
+      <w:i/>
+      <w:iCs/>
+      <w:color w:val="595959" w:themeColor="text1" w:themeTint="A6"/>
+    </w:rPr>
+  </w:style>
+  <w:style w:type="character" w:customStyle="1" w:styleId="Heading7Char">
+    <w:name w:val="Heading 7 Char"/>
+    <w:basedOn w:val="DefaultParagraphFont"/>
+    <w:link w:val="Heading7"/>
+    <w:uiPriority w:val="9"/>
+    <w:semiHidden/>
+    <w:rsid w:val="00A10FD9"/>
+    <w:rPr>
+      <w:rFonts w:eastAsiaTheme="majorEastAsia" w:cstheme="majorBidi"/>
+      <w:color w:val="595959" w:themeColor="text1" w:themeTint="A6"/>
+    </w:rPr>
+  </w:style>
+  <w:style w:type="character" w:customStyle="1" w:styleId="Heading8Char">
+    <w:name w:val="Heading 8 Char"/>
+    <w:basedOn w:val="DefaultParagraphFont"/>
+    <w:link w:val="Heading8"/>
+    <w:uiPriority w:val="9"/>
+    <w:semiHidden/>
+    <w:rsid w:val="00A10FD9"/>
+    <w:rPr>
+      <w:rFonts w:eastAsiaTheme="majorEastAsia" w:cstheme="majorBidi"/>
+      <w:i/>
+      <w:iCs/>
+      <w:color w:val="272727" w:themeColor="text1" w:themeTint="D8"/>
+    </w:rPr>
+  </w:style>
+  <w:style w:type="character" w:customStyle="1" w:styleId="Heading9Char">
+    <w:name w:val="Heading 9 Char"/>
+    <w:basedOn w:val="DefaultParagraphFont"/>
+    <w:link w:val="Heading9"/>
+    <w:uiPriority w:val="9"/>
+    <w:semiHidden/>
+    <w:rsid w:val="00A10FD9"/>
+    <w:rPr>
+      <w:rFonts w:eastAsiaTheme="majorEastAsia" w:cstheme="majorBidi"/>
+      <w:color w:val="272727" w:themeColor="text1" w:themeTint="D8"/>
     </w:rPr>
   </w:style>
   <w:style w:type="paragraph" w:styleId="BlockText">
@@ -1016,6 +1146,18 @@
     <w:uiPriority w:val="9"/>
     <w:unhideWhenUsed/>
     <w:qFormat/>
+  </w:style>
+  <w:style w:type="paragraph" w:styleId="FootnoteBlockText">
+    <w:name w:val="Footnote Block Text"/>
+    <w:basedOn w:val="FootnoteText"/>
+    <w:next w:val="FootnoteText"/>
+    <w:uiPriority w:val="9"/>
+    <w:unhideWhenUsed/>
+    <w:qFormat/>
+    <w:pPr>
+      <w:spacing w:before="100" w:after="100"/>
+      <w:ind w:firstLine="0" w:left="480" w:right="480"/>
+    </w:pPr>
   </w:style>
   <w:style w:type="character" w:default="1" w:styleId="DefaultParagraphFont">
     <w:name w:val="Default Paragraph Font"/>
@@ -1037,6 +1179,14 @@
         <w:right w:w="108" w:type="dxa"/>
       </w:tblCellMar>
     </w:tblPr>
+    <w:tblStylePr w:type="firstRow">
+      <w:tcPr>
+        <w:tcBorders>
+          <w:bottom w:val="single"/>
+        </w:tcBorders>
+        <w:vAlign w:val="bottom"/>
+      </w:tcPr>
+    </w:tblStylePr>
   </w:style>
   <w:style w:type="paragraph" w:customStyle="1" w:styleId="DefinitionTerm">
     <w:name w:val="Definition Term"/>
@@ -1100,6 +1250,10 @@
       <w:rFonts w:ascii="Consolas" w:hAnsi="Consolas"/>
       <w:sz w:val="22"/>
     </w:rPr>
+  </w:style>
+  <w:style w:type="character" w:customStyle="1" w:styleId="SectionNumber">
+    <w:name w:val="Section Number"/>
+    <w:basedOn w:val="BodyTextChar"/>
   </w:style>
   <w:style w:type="character" w:styleId="FootnoteReference">
     <w:name w:val="Footnote Reference"/>
@@ -1147,44 +1301,44 @@
         <a:sysClr val="window" lastClr="FFFFFF"/>
       </a:lt1>
       <a:dk2>
-        <a:srgbClr val="1F497D"/>
+        <a:srgbClr val="0E2841"/>
       </a:dk2>
       <a:lt2>
-        <a:srgbClr val="EEECE1"/>
+        <a:srgbClr val="E8E8E8"/>
       </a:lt2>
       <a:accent1>
-        <a:srgbClr val="4F81BD"/>
+        <a:srgbClr val="156082"/>
       </a:accent1>
       <a:accent2>
-        <a:srgbClr val="C0504D"/>
+        <a:srgbClr val="E97132"/>
       </a:accent2>
       <a:accent3>
-        <a:srgbClr val="9BBB59"/>
+        <a:srgbClr val="196B24"/>
       </a:accent3>
       <a:accent4>
-        <a:srgbClr val="8064A2"/>
+        <a:srgbClr val="0F9ED5"/>
       </a:accent4>
       <a:accent5>
-        <a:srgbClr val="4BACC6"/>
+        <a:srgbClr val="A02B93"/>
       </a:accent5>
       <a:accent6>
-        <a:srgbClr val="F79646"/>
+        <a:srgbClr val="4EA72E"/>
       </a:accent6>
       <a:hlink>
-        <a:srgbClr val="0000FF"/>
+        <a:srgbClr val="467886"/>
       </a:hlink>
       <a:folHlink>
-        <a:srgbClr val="800080"/>
+        <a:srgbClr val="96607D"/>
       </a:folHlink>
     </a:clrScheme>
     <a:fontScheme name="Office">
       <a:majorFont>
-        <a:latin typeface="Calibri"/>
+        <a:latin typeface="Aptos Display" panose="02110004020202020204"/>
         <a:ea typeface=""/>
         <a:cs typeface=""/>
-        <a:font script="Jpan" typeface="ＭＳ ゴシック"/>
+        <a:font script="Jpan" typeface="游ゴシック Light"/>
         <a:font script="Hang" typeface="맑은 고딕"/>
-        <a:font script="Hans" typeface="宋体"/>
+        <a:font script="Hans" typeface="等线 Light"/>
         <a:font script="Hant" typeface="新細明體"/>
         <a:font script="Arab" typeface="Times New Roman"/>
         <a:font script="Hebr" typeface="Times New Roman"/>
@@ -1211,14 +1365,32 @@
         <a:font script="Mong" typeface="Mongolian Baiti"/>
         <a:font script="Viet" typeface="Times New Roman"/>
         <a:font script="Uigh" typeface="Microsoft Uighur"/>
+        <a:font script="Geor" typeface="Sylfaen"/>
+        <a:font script="Armn" typeface="Arial"/>
+        <a:font script="Bugi" typeface="Leelawadee UI"/>
+        <a:font script="Bopo" typeface="Microsoft JhengHei"/>
+        <a:font script="Java" typeface="Javanese Text"/>
+        <a:font script="Lisu" typeface="Segoe UI"/>
+        <a:font script="Mymr" typeface="Myanmar Text"/>
+        <a:font script="Nkoo" typeface="Ebrima"/>
+        <a:font script="Olck" typeface="Nirmala UI"/>
+        <a:font script="Osma" typeface="Ebrima"/>
+        <a:font script="Phag" typeface="Phagspa"/>
+        <a:font script="Syrn" typeface="Estrangelo Edessa"/>
+        <a:font script="Syrj" typeface="Estrangelo Edessa"/>
+        <a:font script="Syre" typeface="Estrangelo Edessa"/>
+        <a:font script="Sora" typeface="Nirmala UI"/>
+        <a:font script="Tale" typeface="Microsoft Tai Le"/>
+        <a:font script="Talu" typeface="Microsoft New Tai Lue"/>
+        <a:font script="Tfng" typeface="Ebrima"/>
       </a:majorFont>
       <a:minorFont>
-        <a:latin typeface="Cambria"/>
+        <a:latin typeface="Aptos" panose="02110004020202020204"/>
         <a:ea typeface=""/>
         <a:cs typeface=""/>
-        <a:font script="Jpan" typeface="ＭＳ 明朝"/>
+        <a:font script="Jpan" typeface="游明朝"/>
         <a:font script="Hang" typeface="맑은 고딕"/>
-        <a:font script="Hans" typeface="宋体"/>
+        <a:font script="Hans" typeface="等线"/>
         <a:font script="Hant" typeface="新細明體"/>
         <a:font script="Arab" typeface="Arial"/>
         <a:font script="Hebr" typeface="Arial"/>
@@ -1245,6 +1417,24 @@
         <a:font script="Mong" typeface="Mongolian Baiti"/>
         <a:font script="Viet" typeface="Arial"/>
         <a:font script="Uigh" typeface="Microsoft Uighur"/>
+        <a:font script="Geor" typeface="Sylfaen"/>
+        <a:font script="Armn" typeface="Arial"/>
+        <a:font script="Bugi" typeface="Leelawadee UI"/>
+        <a:font script="Bopo" typeface="Microsoft JhengHei"/>
+        <a:font script="Java" typeface="Javanese Text"/>
+        <a:font script="Lisu" typeface="Segoe UI"/>
+        <a:font script="Mymr" typeface="Myanmar Text"/>
+        <a:font script="Nkoo" typeface="Ebrima"/>
+        <a:font script="Olck" typeface="Nirmala UI"/>
+        <a:font script="Osma" typeface="Ebrima"/>
+        <a:font script="Phag" typeface="Phagspa"/>
+        <a:font script="Syrn" typeface="Estrangelo Edessa"/>
+        <a:font script="Syrj" typeface="Estrangelo Edessa"/>
+        <a:font script="Syre" typeface="Estrangelo Edessa"/>
+        <a:font script="Sora" typeface="Nirmala UI"/>
+        <a:font script="Tale" typeface="Microsoft Tai Le"/>
+        <a:font script="Talu" typeface="Microsoft New Tai Lue"/>
+        <a:font script="Tfng" typeface="Ebrima"/>
       </a:minorFont>
     </a:fontScheme>
     <a:fmtScheme name="Office">
@@ -1256,200 +1446,141 @@
           <a:gsLst>
             <a:gs pos="0">
               <a:schemeClr val="phClr">
-                <a:tint val="50000"/>
-                <a:satMod val="300000"/>
+                <a:lumMod val="110000"/>
+                <a:satMod val="105000"/>
+                <a:tint val="67000"/>
               </a:schemeClr>
             </a:gs>
-            <a:gs pos="35000">
+            <a:gs pos="50000">
               <a:schemeClr val="phClr">
-                <a:tint val="37000"/>
-                <a:satMod val="300000"/>
+                <a:lumMod val="105000"/>
+                <a:satMod val="103000"/>
+                <a:tint val="73000"/>
               </a:schemeClr>
             </a:gs>
             <a:gs pos="100000">
               <a:schemeClr val="phClr">
-                <a:tint val="15000"/>
-                <a:satMod val="350000"/>
+                <a:lumMod val="105000"/>
+                <a:satMod val="109000"/>
+                <a:tint val="81000"/>
               </a:schemeClr>
             </a:gs>
           </a:gsLst>
-          <a:lin ang="16200000" scaled="1"/>
+          <a:lin ang="5400000" scaled="0"/>
         </a:gradFill>
         <a:gradFill rotWithShape="1">
           <a:gsLst>
             <a:gs pos="0">
               <a:schemeClr val="phClr">
-                <a:tint val="100000"/>
+                <a:satMod val="103000"/>
+                <a:lumMod val="102000"/>
+                <a:tint val="94000"/>
+              </a:schemeClr>
+            </a:gs>
+            <a:gs pos="50000">
+              <a:schemeClr val="phClr">
+                <a:satMod val="110000"/>
+                <a:lumMod val="100000"/>
                 <a:shade val="100000"/>
-                <a:satMod val="130000"/>
               </a:schemeClr>
             </a:gs>
             <a:gs pos="100000">
               <a:schemeClr val="phClr">
-                <a:tint val="50000"/>
-                <a:shade val="100000"/>
-                <a:satMod val="350000"/>
+                <a:lumMod val="99000"/>
+                <a:satMod val="120000"/>
+                <a:shade val="78000"/>
               </a:schemeClr>
             </a:gs>
           </a:gsLst>
-          <a:lin ang="16200000" scaled="0"/>
+          <a:lin ang="5400000" scaled="0"/>
         </a:gradFill>
       </a:fillStyleLst>
       <a:lnStyleLst>
-        <a:ln w="9525" cap="flat" cmpd="sng" algn="ctr">
-          <a:solidFill>
-            <a:schemeClr val="phClr">
-              <a:shade val="95000"/>
-              <a:satMod val="105000"/>
-            </a:schemeClr>
-          </a:solidFill>
-          <a:prstDash val="solid"/>
-        </a:ln>
-        <a:ln w="25400" cap="flat" cmpd="sng" algn="ctr">
+        <a:ln w="6350" cap="flat" cmpd="sng" algn="ctr">
           <a:solidFill>
             <a:schemeClr val="phClr"/>
           </a:solidFill>
           <a:prstDash val="solid"/>
+          <a:miter lim="800000"/>
         </a:ln>
-        <a:ln w="38100" cap="flat" cmpd="sng" algn="ctr">
+        <a:ln w="12700" cap="flat" cmpd="sng" algn="ctr">
           <a:solidFill>
             <a:schemeClr val="phClr"/>
           </a:solidFill>
           <a:prstDash val="solid"/>
+          <a:miter lim="800000"/>
+        </a:ln>
+        <a:ln w="19050" cap="flat" cmpd="sng" algn="ctr">
+          <a:solidFill>
+            <a:schemeClr val="phClr"/>
+          </a:solidFill>
+          <a:prstDash val="solid"/>
+          <a:miter lim="800000"/>
         </a:ln>
       </a:lnStyleLst>
       <a:effectStyleLst>
         <a:effectStyle>
+          <a:effectLst/>
+        </a:effectStyle>
+        <a:effectStyle>
+          <a:effectLst/>
+        </a:effectStyle>
+        <a:effectStyle>
           <a:effectLst>
-            <a:outerShdw blurRad="40000" dist="20000" dir="5400000" rotWithShape="0">
+            <a:outerShdw blurRad="57150" dist="19050" dir="5400000" algn="ctr" rotWithShape="0">
               <a:srgbClr val="000000">
-                <a:alpha val="38000"/>
+                <a:alpha val="63000"/>
               </a:srgbClr>
             </a:outerShdw>
           </a:effectLst>
-        </a:effectStyle>
-        <a:effectStyle>
-          <a:effectLst>
-            <a:outerShdw blurRad="40000" dist="23000" dir="5400000" rotWithShape="0">
-              <a:srgbClr val="000000">
-                <a:alpha val="35000"/>
-              </a:srgbClr>
-            </a:outerShdw>
-          </a:effectLst>
-        </a:effectStyle>
-        <a:effectStyle>
-          <a:effectLst>
-            <a:outerShdw blurRad="40000" dist="23000" dir="5400000" rotWithShape="0">
-              <a:srgbClr val="000000">
-                <a:alpha val="35000"/>
-              </a:srgbClr>
-            </a:outerShdw>
-          </a:effectLst>
-          <a:scene3d>
-            <a:camera prst="orthographicFront">
-              <a:rot lat="0" lon="0" rev="0"/>
-            </a:camera>
-            <a:lightRig rig="threePt" dir="t">
-              <a:rot lat="0" lon="0" rev="1200000"/>
-            </a:lightRig>
-          </a:scene3d>
-          <a:sp3d>
-            <a:bevelT w="63500" h="25400"/>
-          </a:sp3d>
         </a:effectStyle>
       </a:effectStyleLst>
       <a:bgFillStyleLst>
         <a:solidFill>
           <a:schemeClr val="phClr"/>
         </a:solidFill>
+        <a:solidFill>
+          <a:schemeClr val="phClr">
+            <a:tint val="95000"/>
+            <a:satMod val="170000"/>
+          </a:schemeClr>
+        </a:solidFill>
         <a:gradFill rotWithShape="1">
           <a:gsLst>
             <a:gs pos="0">
               <a:schemeClr val="phClr">
-                <a:tint val="40000"/>
-                <a:satMod val="350000"/>
+                <a:tint val="93000"/>
+                <a:satMod val="150000"/>
+                <a:shade val="98000"/>
+                <a:lumMod val="102000"/>
               </a:schemeClr>
             </a:gs>
-            <a:gs pos="40000">
+            <a:gs pos="50000">
               <a:schemeClr val="phClr">
-                <a:tint val="45000"/>
-                <a:shade val="99000"/>
-                <a:satMod val="350000"/>
+                <a:tint val="98000"/>
+                <a:satMod val="130000"/>
+                <a:shade val="90000"/>
+                <a:lumMod val="103000"/>
               </a:schemeClr>
             </a:gs>
             <a:gs pos="100000">
               <a:schemeClr val="phClr">
-                <a:shade val="20000"/>
-                <a:satMod val="255000"/>
+                <a:shade val="63000"/>
+                <a:satMod val="120000"/>
               </a:schemeClr>
             </a:gs>
           </a:gsLst>
-          <a:path path="circle">
-            <a:fillToRect l="50000" t="-80000" r="50000" b="180000"/>
-          </a:path>
-        </a:gradFill>
-        <a:gradFill rotWithShape="1">
-          <a:gsLst>
-            <a:gs pos="0">
-              <a:schemeClr val="phClr">
-                <a:tint val="80000"/>
-                <a:satMod val="300000"/>
-              </a:schemeClr>
-            </a:gs>
-            <a:gs pos="100000">
-              <a:schemeClr val="phClr">
-                <a:shade val="30000"/>
-                <a:satMod val="200000"/>
-              </a:schemeClr>
-            </a:gs>
-          </a:gsLst>
-          <a:path path="circle">
-            <a:fillToRect l="50000" t="50000" r="50000" b="50000"/>
-          </a:path>
+          <a:lin ang="5400000" scaled="0"/>
         </a:gradFill>
       </a:bgFillStyleLst>
     </a:fmtScheme>
   </a:themeElements>
-  <a:objectDefaults>
-    <a:spDef>
-      <a:spPr/>
-      <a:bodyPr/>
-      <a:lstStyle/>
-      <a:style>
-        <a:lnRef idx="1">
-          <a:schemeClr val="accent1"/>
-        </a:lnRef>
-        <a:fillRef idx="3">
-          <a:schemeClr val="accent1"/>
-        </a:fillRef>
-        <a:effectRef idx="2">
-          <a:schemeClr val="accent1"/>
-        </a:effectRef>
-        <a:fontRef idx="minor">
-          <a:schemeClr val="lt1"/>
-        </a:fontRef>
-      </a:style>
-    </a:spDef>
-    <a:lnDef>
-      <a:spPr/>
-      <a:bodyPr/>
-      <a:lstStyle/>
-      <a:style>
-        <a:lnRef idx="2">
-          <a:schemeClr val="accent1"/>
-        </a:lnRef>
-        <a:fillRef idx="0">
-          <a:schemeClr val="accent1"/>
-        </a:fillRef>
-        <a:effectRef idx="1">
-          <a:schemeClr val="accent1"/>
-        </a:effectRef>
-        <a:fontRef idx="minor">
-          <a:schemeClr val="tx1"/>
-        </a:fontRef>
-      </a:style>
-    </a:lnDef>
-  </a:objectDefaults>
+  <a:objectDefaults/>
   <a:extraClrSchemeLst/>
+  <a:extLst>
+    <a:ext uri="{05A4C25C-085E-4340-85A3-A5531E510DB2}">
+      <thm15:themeFamily xmlns:thm15="http://schemas.microsoft.com/office/thememl/2012/main" name="Office Theme" id="{2E142A2C-CD16-42D6-873A-C26D2A0506FA}" vid="{1BDDFF52-6CD6-40A5-AB3C-68EB2F1E4D0A}"/>
+    </a:ext>
+  </a:extLst>
 </a:theme>
 </file>
</xml_diff>

<commit_message>
[CUR-1161] URS pipeline cleanup (#620)
## Summary

- Remove compiled URS deliverables and archived source under `docs/`;
these are reproducible from `spec/` on demand and do not need to be
checked in here.
- Remove deployment-overlay content from `spec/URS-manifest/` (cover,
term-index cover, frontmatter).
- Replace literal values in `tools/urs-template.latex` and
`tools/build-docx-reference.py` with build-time placeholders; regenerate
`tools/urs-reference.docx` from the parameterised script.
- Replace literal values in two `sponsor_branding.dart` doc-comment JSON
examples with placeholders.

Co-authored-by: Claude Opus 4.7 (1M context) <noreply@anthropic.com>
</commit_message>
<xml_diff>
--- a/tools/urs-reference.docx
+++ b/tools/urs-reference.docx
@@ -7,9 +7,7 @@
         <w:pStyle w:val="Title"/>
       </w:pPr>
       <w:r>
-        <w:t xml:space="preserve">
-Title
-</w:t>
+        <w:t xml:space="preserve">Title</w:t>
       </w:r>
     </w:p>
     <w:p>
@@ -17,9 +15,7 @@
         <w:pStyle w:val="Subtitle"/>
       </w:pPr>
       <w:r>
-        <w:t xml:space="preserve">
-Subtitle
-</w:t>
+        <w:t xml:space="preserve">Subtitle</w:t>
       </w:r>
     </w:p>
     <w:p>
@@ -27,9 +23,7 @@
         <w:pStyle w:val="Author"/>
       </w:pPr>
       <w:r>
-        <w:t xml:space="preserve">
-Author
-</w:t>
+        <w:t xml:space="preserve">Author</w:t>
       </w:r>
     </w:p>
     <w:p>
@@ -37,20 +31,15 @@
         <w:pStyle w:val="Date"/>
       </w:pPr>
       <w:r>
-        <w:t xml:space="preserve">
-Date
-</w:t>
-      </w:r>
-    </w:p>
-    <w:p>
-      <w:pPr>
-        <w:pStyle w:val="Compact"/>
+        <w:t xml:space="preserve">Date</w:t>
+      </w:r>
+    </w:p>
+    <w:p>
+      <w:pPr>
         <w:pStyle w:val="Abstract"/>
       </w:pPr>
       <w:r>
-        <w:t xml:space="preserve">
-Abstract
-</w:t>
+        <w:t xml:space="preserve">Abstract</w:t>
       </w:r>
     </w:p>
     <w:p>
@@ -59,9 +48,7 @@
       </w:pPr>
       <w:bookmarkStart w:id="21" w:name="heading-1"/>
       <w:r>
-        <w:t xml:space="preserve">
-Heading 1
-</w:t>
+        <w:t xml:space="preserve">Heading 1</w:t>
       </w:r>
       <w:bookmarkEnd w:id="21"/>
     </w:p>
@@ -71,9 +58,7 @@
       </w:pPr>
       <w:bookmarkStart w:id="22" w:name="heading-2"/>
       <w:r>
-        <w:t xml:space="preserve">
-Heading 2
-</w:t>
+        <w:t xml:space="preserve">Heading 2</w:t>
       </w:r>
       <w:bookmarkEnd w:id="22"/>
     </w:p>
@@ -83,9 +68,7 @@
       </w:pPr>
       <w:bookmarkStart w:id="23" w:name="heading-3"/>
       <w:r>
-        <w:t xml:space="preserve">
-Heading 3
-</w:t>
+        <w:t xml:space="preserve">Heading 3</w:t>
       </w:r>
       <w:bookmarkEnd w:id="23"/>
     </w:p>
@@ -95,9 +78,7 @@
       </w:pPr>
       <w:bookmarkStart w:id="24" w:name="heading-4"/>
       <w:r>
-        <w:t xml:space="preserve">
-Heading 4
-</w:t>
+        <w:t xml:space="preserve">Heading 4</w:t>
       </w:r>
       <w:bookmarkEnd w:id="24"/>
     </w:p>
@@ -107,9 +88,7 @@
       </w:pPr>
       <w:bookmarkStart w:id="25" w:name="heading-5"/>
       <w:r>
-        <w:t xml:space="preserve">
-Heading 5
-</w:t>
+        <w:t xml:space="preserve">Heading 5</w:t>
       </w:r>
       <w:bookmarkEnd w:id="25"/>
     </w:p>
@@ -119,9 +98,7 @@
       </w:pPr>
       <w:bookmarkStart w:id="26" w:name="heading-6"/>
       <w:r>
-        <w:t xml:space="preserve">
-Heading 6
-</w:t>
+        <w:t xml:space="preserve">Heading 6</w:t>
       </w:r>
       <w:bookmarkEnd w:id="26"/>
     </w:p>
@@ -131,9 +108,7 @@
       </w:pPr>
       <w:bookmarkStart w:id="27" w:name="heading-7"/>
       <w:r>
-        <w:t xml:space="preserve">
-Heading 7
-</w:t>
+        <w:t xml:space="preserve">Heading 7</w:t>
       </w:r>
       <w:bookmarkEnd w:id="27"/>
     </w:p>
@@ -143,9 +118,7 @@
       </w:pPr>
       <w:bookmarkStart w:id="28" w:name="heading-8"/>
       <w:r>
-        <w:t xml:space="preserve">
-Heading 8
-</w:t>
+        <w:t xml:space="preserve">Heading 8</w:t>
       </w:r>
       <w:bookmarkEnd w:id="28"/>
     </w:p>
@@ -155,9 +128,7 @@
       </w:pPr>
       <w:bookmarkStart w:id="29" w:name="heading-9"/>
       <w:r>
-        <w:t xml:space="preserve">
-Heading 9
-</w:t>
+        <w:t xml:space="preserve">Heading 9</w:t>
       </w:r>
       <w:bookmarkEnd w:id="29"/>
     </w:p>
@@ -166,9 +137,7 @@
         <w:pStyle w:val="FirstParagraph"/>
       </w:pPr>
       <w:r>
-        <w:t xml:space="preserve">
-First Paragraph.
-</w:t>
+        <w:t xml:space="preserve">First Paragraph.</w:t>
       </w:r>
     </w:p>
     <w:p>
@@ -176,54 +145,39 @@
         <w:pStyle w:val="BodyText"/>
       </w:pPr>
       <w:r>
-        <w:t xml:space="preserve">
-Body Text. Body Text Char.
-</w:t>
-      </w:r>
-      <w:r>
-        <w:t xml:space="preserve">
-</w:t>
+        <w:t xml:space="preserve">Body Text. Body Text Char.</w:t>
+      </w:r>
+      <w:r>
+        <w:t xml:space="preserve"> </w:t>
       </w:r>
       <w:r>
         <w:rPr>
           <w:rStyle w:val="VerbatimChar"/>
         </w:rPr>
-        <w:t xml:space="preserve">
-Verbatim Char
-</w:t>
-      </w:r>
-      <w:r>
-        <w:t xml:space="preserve">
-.
-</w:t>
-      </w:r>
-      <w:r>
-        <w:t xml:space="preserve">
-</w:t>
+        <w:t xml:space="preserve">Verbatim Char</w:t>
+      </w:r>
+      <w:r>
+        <w:t xml:space="preserve">.</w:t>
+      </w:r>
+      <w:r>
+        <w:t xml:space="preserve"> </w:t>
       </w:r>
       <w:hyperlink r:id="rId30">
         <w:r>
           <w:rPr>
             <w:rStyle w:val="Hyperlink"/>
           </w:rPr>
-          <w:t xml:space="preserve">
-Hyperlink
-</w:t>
+          <w:t xml:space="preserve">Hyperlink</w:t>
         </w:r>
       </w:hyperlink>
       <w:r>
-        <w:t xml:space="preserve">
-.
-</w:t>
-      </w:r>
-      <w:r>
-        <w:t xml:space="preserve">
-</w:t>
-      </w:r>
-      <w:r>
-        <w:t xml:space="preserve">
-Footnote.
-</w:t>
+        <w:t xml:space="preserve">.</w:t>
+      </w:r>
+      <w:r>
+        <w:t xml:space="preserve"> </w:t>
+      </w:r>
+      <w:r>
+        <w:t xml:space="preserve">Footnote.</w:t>
       </w:r>
       <w:r>
         <w:rPr>
@@ -237,9 +191,7 @@
         <w:pStyle w:val="BlockText"/>
       </w:pPr>
       <w:r>
-        <w:t xml:space="preserve">
-Block Text.
-</w:t>
+        <w:t xml:space="preserve">Block Text.</w:t>
       </w:r>
     </w:p>
     <w:p>
@@ -247,22 +199,19 @@
         <w:pStyle w:val="TableCaption"/>
       </w:pPr>
       <w:r>
-        <w:t xml:space="preserve">
-Table caption.
-</w:t>
+        <w:t xml:space="preserve">Table caption.</w:t>
       </w:r>
     </w:p>
     <w:tbl>
       <w:tblPr>
         <w:tblStyle w:val="Table"/>
-        <w:tblW w:type="pct" w:w="0.0"/>
         <w:tblLook w:firstRow="1"/>
         <w:tblCaption w:val="Table caption."/>
       </w:tblPr>
       <w:tblGrid/>
       <w:tr>
         <w:trPr>
-          <w:cnfStyle w:firstRow="1"/>
+          <w:cnfStyle w:firstRow="1" w:val="100000000000"/>
         </w:trPr>
         <w:tc>
           <w:tcPr>
@@ -277,9 +226,7 @@
               <w:jc w:val="left"/>
             </w:pPr>
             <w:r>
-              <w:t xml:space="preserve">
-Table
-</w:t>
+              <w:t xml:space="preserve">Table</w:t>
             </w:r>
           </w:p>
         </w:tc>
@@ -296,9 +243,7 @@
               <w:jc w:val="left"/>
             </w:pPr>
             <w:r>
-              <w:t xml:space="preserve">
-Table
-</w:t>
+              <w:t xml:space="preserve">Table</w:t>
             </w:r>
           </w:p>
         </w:tc>
@@ -311,9 +256,7 @@
               <w:jc w:val="left"/>
             </w:pPr>
             <w:r>
-              <w:t xml:space="preserve">
-1
-</w:t>
+              <w:t xml:space="preserve">1</w:t>
             </w:r>
           </w:p>
         </w:tc>
@@ -324,9 +267,7 @@
               <w:jc w:val="left"/>
             </w:pPr>
             <w:r>
-              <w:t xml:space="preserve">
-2
-</w:t>
+              <w:t xml:space="preserve">2</w:t>
             </w:r>
           </w:p>
         </w:tc>
@@ -337,9 +278,7 @@
         <w:pStyle w:val="ImageCaption"/>
       </w:pPr>
       <w:r>
-        <w:t xml:space="preserve">
-Image Caption
-</w:t>
+        <w:t xml:space="preserve">Image Caption</w:t>
       </w:r>
     </w:p>
     <w:p>
@@ -347,9 +286,7 @@
         <w:pStyle w:val="DefinitionTerm"/>
       </w:pPr>
       <w:r>
-        <w:t xml:space="preserve">
-DefinitionTerm
-</w:t>
+        <w:t xml:space="preserve">DefinitionTerm</w:t>
       </w:r>
     </w:p>
     <w:p>
@@ -357,9 +294,7 @@
         <w:pStyle w:val="Definition"/>
       </w:pPr>
       <w:r>
-        <w:t xml:space="preserve">
-Definition
-</w:t>
+        <w:t xml:space="preserve">Definition</w:t>
       </w:r>
     </w:p>
     <w:p>
@@ -367,9 +302,7 @@
         <w:pStyle w:val="DefinitionTerm"/>
       </w:pPr>
       <w:r>
-        <w:t xml:space="preserve">
-DefinitionTerm
-</w:t>
+        <w:t xml:space="preserve">DefinitionTerm</w:t>
       </w:r>
     </w:p>
     <w:p>
@@ -377,14 +310,15 @@
         <w:pStyle w:val="Definition"/>
       </w:pPr>
       <w:r>
-        <w:t xml:space="preserve">
-Definition
-</w:t>
+        <w:t xml:space="preserve">Definition</w:t>
       </w:r>
     </w:p>
     <w:sectPr>
       <w:headerReference w:type="default" r:id="rId9"/>
       <w:footerReference w:type="default" r:id="rId10"/>
+      <w:footnotePr>
+        <w:numRestart w:val="eachSect"/>
+      </w:footnotePr>
     </w:sectPr>
   </w:body>
 </w:document>
@@ -419,7 +353,7 @@
             <w:rPr>
               <w:sz w:val="18"/>
             </w:rPr>
-            <w:t>Specific to Protocol TER-4480-C01</w:t>
+            <w:t>Specific to Protocol [PROTOCOL]</w:t>
           </w:r>
         </w:p>
       </w:tc>
@@ -508,10 +442,15 @@
         <w:footnoteRef/>
       </w:r>
       <w:r>
-        <w:t xml:space="preserve"> </w:t>
-      </w:r>
-      <w:r>
-        <w:t xml:space="preserve">Footnote Text.</w:t>
+        <w:t>Footnote Text.</w:t>
+      </w:r>
+    </w:p>
+    <w:p>
+      <w:pPr>
+        <w:pStyle w:val="FootnoteBlockText"/>
+      </w:pPr>
+      <w:r>
+        <w:t>Footnote Block Text</w:t>
       </w:r>
     </w:p>
   </w:footnote>
@@ -542,7 +481,7 @@
         <w:rFonts w:ascii="Arial" w:hAnsi="Arial"/>
         <w:sz w:val="18"/>
       </w:rPr>
-      <w:t>Sponsor: Terremoto Biosciences</w:t>
+      <w:t>Sponsor: [SPONSOR_NAME]</w:t>
     </w:r>
   </w:p>
   <w:p>
@@ -554,7 +493,7 @@
         <w:rFonts w:ascii="Arial" w:hAnsi="Arial"/>
         <w:sz w:val="18"/>
       </w:rPr>
-      <w:t>Protocol: TER-4480-C01    Version: 1.0</w:t>
+      <w:t>Protocol: [PROTOCOL]    Version: 1.0</w:t>
     </w:r>
   </w:p>
 </w:hdr>
@@ -676,10 +615,10 @@
   <w:docDefaults>
     <w:rPrDefault>
       <w:rPr>
-        <w:rFonts w:asciiTheme="minorHAnsi" w:eastAsiaTheme="minorHAnsi" w:hAnsiTheme="minorHAnsi" w:cstheme="minorBidi"/>
+        <w:rFonts w:asciiTheme="minorHAnsi" w:eastAsiaTheme="minorEastAsia" w:hAnsiTheme="minorHAnsi" w:cstheme="minorBidi"/>
         <w:sz w:val="24"/>
         <w:szCs w:val="24"/>
-        <w:lang w:val="en-US" w:eastAsia="en-US" w:bidi="ar-SA"/>
+        <w:lang w:val="en-US" w:eastAsia="zh-CN" w:bidi="ar-SA"/>
       </w:rPr>
     </w:rPrDefault>
     <w:pPrDefault>
@@ -704,10 +643,10 @@
     <w:name w:val="Body Text"/>
     <w:basedOn w:val="Normal"/>
     <w:link w:val="BodyTextChar"/>
+    <w:qFormat/>
     <w:pPr>
       <w:spacing w:before="180" w:after="180"/>
     </w:pPr>
-    <w:qFormat/>
   </w:style>
   <w:style w:type="paragraph" w:customStyle="1" w:styleId="FirstParagraph">
     <w:name w:val="First Paragraph"/>
@@ -727,57 +666,113 @@
     <w:name w:val="Title"/>
     <w:basedOn w:val="Normal"/>
     <w:next w:val="BodyText"/>
-    <w:qFormat/>
-    <w:pPr>
-      <w:keepNext/>
-      <w:keepLines/>
-      <w:spacing w:before="480" w:after="480"/>
+    <w:link w:val="TitleChar"/>
+    <w:uiPriority w:val="10"/>
+    <w:qFormat/>
+    <w:rsid w:val="00A10FD9"/>
+    <w:pPr>
+      <w:spacing w:after="480" w:line="240" w:lineRule="auto"/>
+      <w:contextualSpacing/>
       <w:jc w:val="center"/>
     </w:pPr>
     <w:rPr>
       <w:rFonts w:asciiTheme="majorHAnsi" w:eastAsiaTheme="majorEastAsia" w:hAnsiTheme="majorHAnsi" w:cstheme="majorBidi" w:ascii="Arial" w:hAnsi="Arial"/>
       <w:b/>
-      <w:bCs/>
       <w:color w:val="1F3A5F"/>
       <w:sz w:val="48"/>
-      <w:szCs w:val="36"/>
+      <w:szCs w:val="56"/>
+    </w:rPr>
+  </w:style>
+  <w:style w:type="character" w:customStyle="1" w:styleId="TitleChar">
+    <w:name w:val="Title Char"/>
+    <w:basedOn w:val="DefaultParagraphFont"/>
+    <w:link w:val="Title"/>
+    <w:uiPriority w:val="10"/>
+    <w:rsid w:val="00A10FD9"/>
+    <w:rPr>
+      <w:rFonts w:asciiTheme="majorHAnsi" w:eastAsiaTheme="majorEastAsia" w:hAnsiTheme="majorHAnsi" w:cstheme="majorBidi"/>
+      <w:sz w:val="56"/>
+      <w:szCs w:val="56"/>
     </w:rPr>
   </w:style>
   <w:style w:type="paragraph" w:styleId="Subtitle">
     <w:name w:val="Subtitle"/>
     <w:basedOn w:val="Title"/>
     <w:next w:val="BodyText"/>
+    <w:link w:val="SubtitleChar"/>
+    <w:uiPriority w:val="11"/>
+    <w:qFormat/>
+    <w:rsid w:val="00A10FD9"/>
+    <w:pPr>
+      <w:numPr>
+        <w:ilvl w:val="1"/>
+      </w:numPr>
+    </w:pPr>
+    <w:rPr>
+      <w:rFonts w:eastAsiaTheme="majorEastAsia" w:cstheme="majorBidi"/>
+      <w:spacing w:val="15"/>
+      <w:sz w:val="28"/>
+      <w:szCs w:val="28"/>
+    </w:rPr>
+  </w:style>
+  <w:style w:type="character" w:customStyle="1" w:styleId="SubtitleChar">
+    <w:name w:val="Subtitle Char"/>
+    <w:basedOn w:val="DefaultParagraphFont"/>
+    <w:link w:val="Subtitle"/>
+    <w:uiPriority w:val="11"/>
+    <w:rsid w:val="00A10FD9"/>
+    <w:rPr>
+      <w:rFonts w:eastAsiaTheme="majorEastAsia" w:cstheme="majorBidi"/>
+      <w:color w:val="595959" w:themeColor="text1" w:themeTint="A6"/>
+      <w:spacing w:val="15"/>
+      <w:sz w:val="28"/>
+      <w:szCs w:val="28"/>
+    </w:rPr>
+  </w:style>
+  <w:style w:type="paragraph" w:customStyle="1" w:styleId="Author">
+    <w:name w:val="Author"/>
+    <w:basedOn w:val="Title"/>
+    <w:next w:val="BodyText"/>
     <w:qFormat/>
     <w:pPr>
       <w:keepNext/>
       <w:keepLines/>
-      <w:spacing w:before="240" w:after="240"/>
-      <w:jc w:val="center"/>
-    </w:pPr>
-    <w:rPr>
-      <w:sz w:val="30"/>
-      <w:szCs w:val="30"/>
-    </w:rPr>
-  </w:style>
-  <w:style w:type="paragraph" w:customStyle="1" w:styleId="Author">
-    <w:name w:val="Author"/>
+    </w:pPr>
+    <w:rPr>
+      <w:sz w:val="24"/>
+      <w:szCs w:val="24"/>
+    </w:rPr>
+  </w:style>
+  <w:style w:type="paragraph" w:styleId="Date">
+    <w:name w:val="Date"/>
+    <w:basedOn w:val="Title"/>
     <w:next w:val="BodyText"/>
     <w:qFormat/>
     <w:pPr>
       <w:keepNext/>
       <w:keepLines/>
-      <w:jc w:val="center"/>
-    </w:pPr>
-  </w:style>
-  <w:style w:type="paragraph" w:styleId="Date">
-    <w:name w:val="Date"/>
-    <w:next w:val="BodyText"/>
+    </w:pPr>
+    <w:rPr>
+      <w:sz w:val="24"/>
+      <w:szCs w:val="24"/>
+    </w:rPr>
+  </w:style>
+  <w:style w:type="paragraph" w:customStyle="1" w:styleId="AbstractTitle">
+    <w:name w:val="Abstract Title"/>
+    <w:basedOn w:val="Normal"/>
+    <w:next w:val="Abstract"/>
     <w:qFormat/>
     <w:pPr>
       <w:keepNext/>
       <w:keepLines/>
+      <w:spacing w:before="300" w:after="0"/>
       <w:jc w:val="center"/>
     </w:pPr>
+    <w:rPr>
+      <w:b/>
+      <w:sz w:val="20"/>
+      <w:szCs w:val="20"/>
+    </w:rPr>
   </w:style>
   <w:style w:type="paragraph" w:customStyle="1" w:styleId="Abstract">
     <w:name w:val="Abstract"/>
@@ -787,7 +782,7 @@
     <w:pPr>
       <w:keepNext/>
       <w:keepLines/>
-      <w:spacing w:before="300" w:after="300"/>
+      <w:spacing w:before="100" w:after="300"/>
     </w:pPr>
     <w:rPr>
       <w:sz w:val="20"/>
@@ -803,11 +798,13 @@
     <w:rPr/>
   </w:style>
   <w:style w:type="paragraph" w:styleId="Heading1">
-    <w:name w:val="Heading 1"/>
-    <w:basedOn w:val="Normal"/>
-    <w:next w:val="BodyText"/>
-    <w:uiPriority w:val="9"/>
-    <w:qFormat/>
+    <w:name w:val="heading 1"/>
+    <w:basedOn w:val="Normal"/>
+    <w:next w:val="BodyText"/>
+    <w:link w:val="Heading1Char"/>
+    <w:uiPriority w:val="9"/>
+    <w:qFormat/>
+    <w:rsid w:val="00A10FD9"/>
     <w:pPr>
       <w:keepNext/>
       <w:keepLines/>
@@ -818,20 +815,22 @@
     <w:rPr>
       <w:rFonts w:asciiTheme="majorHAnsi" w:eastAsiaTheme="majorEastAsia" w:hAnsiTheme="majorHAnsi" w:cstheme="majorBidi" w:ascii="Arial" w:hAnsi="Arial"/>
       <w:b/>
-      <w:bCs/>
       <w:i w:val="0"/>
       <w:color w:val="1F3A5F"/>
       <w:sz w:val="36"/>
-      <w:szCs w:val="32"/>
+      <w:szCs w:val="40"/>
     </w:rPr>
   </w:style>
   <w:style w:type="paragraph" w:styleId="Heading2">
-    <w:name w:val="Heading 2"/>
-    <w:basedOn w:val="Normal"/>
-    <w:next w:val="BodyText"/>
-    <w:uiPriority w:val="9"/>
+    <w:name w:val="heading 2"/>
+    <w:basedOn w:val="Normal"/>
+    <w:next w:val="BodyText"/>
+    <w:link w:val="Heading2Char"/>
+    <w:uiPriority w:val="9"/>
+    <w:semiHidden/>
     <w:unhideWhenUsed/>
     <w:qFormat/>
+    <w:rsid w:val="00A10FD9"/>
     <w:pPr>
       <w:keepNext/>
       <w:keepLines/>
@@ -841,20 +840,22 @@
     <w:rPr>
       <w:rFonts w:asciiTheme="majorHAnsi" w:eastAsiaTheme="majorEastAsia" w:hAnsiTheme="majorHAnsi" w:cstheme="majorBidi" w:ascii="Arial" w:hAnsi="Arial"/>
       <w:b/>
-      <w:bCs/>
       <w:i w:val="0"/>
       <w:color w:val="1F3A5F"/>
       <w:sz w:val="28"/>
-      <w:szCs w:val="28"/>
+      <w:szCs w:val="32"/>
     </w:rPr>
   </w:style>
   <w:style w:type="paragraph" w:styleId="Heading3">
-    <w:name w:val="Heading 3"/>
-    <w:basedOn w:val="Normal"/>
-    <w:next w:val="BodyText"/>
-    <w:uiPriority w:val="9"/>
+    <w:name w:val="heading 3"/>
+    <w:basedOn w:val="Normal"/>
+    <w:next w:val="BodyText"/>
+    <w:link w:val="Heading3Char"/>
+    <w:uiPriority w:val="9"/>
+    <w:semiHidden/>
     <w:unhideWhenUsed/>
     <w:qFormat/>
+    <w:rsid w:val="00A10FD9"/>
     <w:pPr>
       <w:keepNext/>
       <w:keepLines/>
@@ -862,22 +863,24 @@
       <w:outlineLvl w:val="2"/>
     </w:pPr>
     <w:rPr>
-      <w:rFonts w:asciiTheme="majorHAnsi" w:eastAsiaTheme="majorEastAsia" w:hAnsiTheme="majorHAnsi" w:cstheme="majorBidi" w:ascii="Arial" w:hAnsi="Arial"/>
+      <w:rFonts w:eastAsiaTheme="majorEastAsia" w:cstheme="majorBidi" w:ascii="Arial" w:hAnsi="Arial"/>
       <w:b/>
-      <w:bCs/>
       <w:i w:val="0"/>
       <w:color w:val="1F3A5F"/>
       <w:sz w:val="24"/>
-      <w:szCs w:val="24"/>
+      <w:szCs w:val="28"/>
     </w:rPr>
   </w:style>
   <w:style w:type="paragraph" w:styleId="Heading4">
-    <w:name w:val="Heading 4"/>
-    <w:basedOn w:val="Normal"/>
-    <w:next w:val="BodyText"/>
-    <w:uiPriority w:val="9"/>
+    <w:name w:val="heading 4"/>
+    <w:basedOn w:val="Normal"/>
+    <w:next w:val="BodyText"/>
+    <w:link w:val="Heading4Char"/>
+    <w:uiPriority w:val="9"/>
+    <w:semiHidden/>
     <w:unhideWhenUsed/>
     <w:qFormat/>
+    <w:rsid w:val="00A10FD9"/>
     <w:pPr>
       <w:keepNext/>
       <w:keepLines/>
@@ -885,22 +888,24 @@
       <w:outlineLvl w:val="3"/>
     </w:pPr>
     <w:rPr>
-      <w:rFonts w:asciiTheme="majorHAnsi" w:eastAsiaTheme="majorEastAsia" w:hAnsiTheme="majorHAnsi" w:cstheme="majorBidi" w:ascii="Arial" w:hAnsi="Arial"/>
+      <w:rFonts w:eastAsiaTheme="majorEastAsia" w:cstheme="majorBidi" w:ascii="Arial" w:hAnsi="Arial"/>
+      <w:b/>
       <w:i/>
-      <w:b/>
-      <w:bCs/>
+      <w:iCs/>
       <w:color w:val="1F3A5F"/>
       <w:sz w:val="22"/>
-      <w:szCs w:val="24"/>
     </w:rPr>
   </w:style>
   <w:style w:type="paragraph" w:styleId="Heading5">
-    <w:name w:val="Heading 5"/>
-    <w:basedOn w:val="Normal"/>
-    <w:next w:val="BodyText"/>
-    <w:uiPriority w:val="9"/>
+    <w:name w:val="heading 5"/>
+    <w:basedOn w:val="Normal"/>
+    <w:next w:val="BodyText"/>
+    <w:link w:val="Heading5Char"/>
+    <w:uiPriority w:val="9"/>
+    <w:semiHidden/>
     <w:unhideWhenUsed/>
     <w:qFormat/>
+    <w:rsid w:val="00A10FD9"/>
     <w:pPr>
       <w:keepNext/>
       <w:keepLines/>
@@ -908,93 +913,218 @@
       <w:outlineLvl w:val="4"/>
     </w:pPr>
     <w:rPr>
-      <w:rFonts w:asciiTheme="majorHAnsi" w:eastAsiaTheme="majorEastAsia" w:hAnsiTheme="majorHAnsi" w:cstheme="majorBidi" w:ascii="Arial" w:hAnsi="Arial"/>
+      <w:rFonts w:eastAsiaTheme="majorEastAsia" w:cstheme="majorBidi" w:ascii="Arial" w:hAnsi="Arial"/>
       <w:b w:val="0"/>
       <w:i/>
-      <w:iCs/>
       <w:color w:val="404040"/>
       <w:sz w:val="22"/>
-      <w:szCs w:val="24"/>
     </w:rPr>
   </w:style>
   <w:style w:type="paragraph" w:styleId="Heading6">
-    <w:name w:val="Heading 6"/>
-    <w:basedOn w:val="Normal"/>
-    <w:next w:val="BodyText"/>
-    <w:uiPriority w:val="9"/>
+    <w:name w:val="heading 6"/>
+    <w:basedOn w:val="Normal"/>
+    <w:next w:val="BodyText"/>
+    <w:link w:val="Heading6Char"/>
+    <w:uiPriority w:val="9"/>
+    <w:semiHidden/>
     <w:unhideWhenUsed/>
     <w:qFormat/>
+    <w:rsid w:val="00A10FD9"/>
     <w:pPr>
       <w:keepNext/>
       <w:keepLines/>
-      <w:spacing w:before="200" w:after="0"/>
+      <w:spacing w:before="40" w:after="0"/>
       <w:outlineLvl w:val="5"/>
     </w:pPr>
     <w:rPr>
-      <w:rFonts w:asciiTheme="majorHAnsi" w:eastAsiaTheme="majorEastAsia" w:hAnsiTheme="majorHAnsi" w:cstheme="majorBidi"/>
-      <w:color w:val="4F81BD" w:themeColor="accent1"/>
-      <w:sz w:val="24"/>
-      <w:szCs w:val="24"/>
+      <w:rFonts w:eastAsiaTheme="majorEastAsia" w:cstheme="majorBidi"/>
+      <w:i/>
+      <w:iCs/>
+      <w:color w:val="595959" w:themeColor="text1" w:themeTint="A6"/>
     </w:rPr>
   </w:style>
   <w:style w:type="paragraph" w:styleId="Heading7">
-    <w:name w:val="Heading 7"/>
-    <w:basedOn w:val="Normal"/>
-    <w:next w:val="BodyText"/>
-    <w:uiPriority w:val="9"/>
+    <w:name w:val="heading 7"/>
+    <w:basedOn w:val="Normal"/>
+    <w:next w:val="BodyText"/>
+    <w:link w:val="Heading7Char"/>
+    <w:uiPriority w:val="9"/>
+    <w:semiHidden/>
     <w:unhideWhenUsed/>
     <w:qFormat/>
+    <w:rsid w:val="00A10FD9"/>
     <w:pPr>
       <w:keepNext/>
       <w:keepLines/>
-      <w:spacing w:before="200" w:after="0"/>
+      <w:spacing w:before="40" w:after="0"/>
       <w:outlineLvl w:val="6"/>
     </w:pPr>
     <w:rPr>
-      <w:rFonts w:asciiTheme="majorHAnsi" w:eastAsiaTheme="majorEastAsia" w:hAnsiTheme="majorHAnsi" w:cstheme="majorBidi"/>
-      <w:color w:val="4F81BD" w:themeColor="accent1"/>
-      <w:sz w:val="24"/>
-      <w:szCs w:val="24"/>
+      <w:rFonts w:eastAsiaTheme="majorEastAsia" w:cstheme="majorBidi"/>
+      <w:color w:val="595959" w:themeColor="text1" w:themeTint="A6"/>
     </w:rPr>
   </w:style>
   <w:style w:type="paragraph" w:styleId="Heading8">
-    <w:name w:val="Heading 8"/>
-    <w:basedOn w:val="Normal"/>
-    <w:next w:val="BodyText"/>
-    <w:uiPriority w:val="9"/>
+    <w:name w:val="heading 8"/>
+    <w:basedOn w:val="Normal"/>
+    <w:next w:val="BodyText"/>
+    <w:link w:val="Heading8Char"/>
+    <w:uiPriority w:val="9"/>
+    <w:semiHidden/>
     <w:unhideWhenUsed/>
     <w:qFormat/>
+    <w:rsid w:val="00A10FD9"/>
     <w:pPr>
       <w:keepNext/>
       <w:keepLines/>
-      <w:spacing w:before="200" w:after="0"/>
+      <w:spacing w:after="0"/>
       <w:outlineLvl w:val="7"/>
     </w:pPr>
     <w:rPr>
-      <w:rFonts w:asciiTheme="majorHAnsi" w:eastAsiaTheme="majorEastAsia" w:hAnsiTheme="majorHAnsi" w:cstheme="majorBidi"/>
-      <w:color w:val="4F81BD" w:themeColor="accent1"/>
-      <w:sz w:val="24"/>
-      <w:szCs w:val="24"/>
+      <w:rFonts w:eastAsiaTheme="majorEastAsia" w:cstheme="majorBidi"/>
+      <w:i/>
+      <w:iCs/>
+      <w:color w:val="272727" w:themeColor="text1" w:themeTint="D8"/>
     </w:rPr>
   </w:style>
   <w:style w:type="paragraph" w:styleId="Heading9">
-    <w:name w:val="Heading 9"/>
-    <w:basedOn w:val="Normal"/>
-    <w:next w:val="BodyText"/>
-    <w:uiPriority w:val="9"/>
+    <w:name w:val="heading 9"/>
+    <w:basedOn w:val="Normal"/>
+    <w:next w:val="BodyText"/>
+    <w:link w:val="Heading9Char"/>
+    <w:uiPriority w:val="9"/>
+    <w:semiHidden/>
     <w:unhideWhenUsed/>
     <w:qFormat/>
+    <w:rsid w:val="00A10FD9"/>
     <w:pPr>
       <w:keepNext/>
       <w:keepLines/>
-      <w:spacing w:before="200" w:after="0"/>
+      <w:spacing w:after="0"/>
       <w:outlineLvl w:val="8"/>
     </w:pPr>
     <w:rPr>
+      <w:rFonts w:eastAsiaTheme="majorEastAsia" w:cstheme="majorBidi"/>
+      <w:color w:val="272727" w:themeColor="text1" w:themeTint="D8"/>
+    </w:rPr>
+  </w:style>
+  <w:style w:type="character" w:customStyle="1" w:styleId="Heading1Char">
+    <w:name w:val="Heading 1 Char"/>
+    <w:basedOn w:val="DefaultParagraphFont"/>
+    <w:link w:val="Heading1"/>
+    <w:uiPriority w:val="9"/>
+    <w:rsid w:val="00A10FD9"/>
+    <w:rPr>
       <w:rFonts w:asciiTheme="majorHAnsi" w:eastAsiaTheme="majorEastAsia" w:hAnsiTheme="majorHAnsi" w:cstheme="majorBidi"/>
-      <w:color w:val="4F81BD" w:themeColor="accent1"/>
-      <w:sz w:val="24"/>
-      <w:szCs w:val="24"/>
+      <w:color w:val="0F4761" w:themeColor="accent1" w:themeShade="BF"/>
+      <w:sz w:val="40"/>
+      <w:szCs w:val="40"/>
+    </w:rPr>
+  </w:style>
+  <w:style w:type="character" w:customStyle="1" w:styleId="Heading2Char">
+    <w:name w:val="Heading 2 Char"/>
+    <w:basedOn w:val="DefaultParagraphFont"/>
+    <w:link w:val="Heading2"/>
+    <w:uiPriority w:val="9"/>
+    <w:semiHidden/>
+    <w:rsid w:val="00A10FD9"/>
+    <w:rPr>
+      <w:rFonts w:asciiTheme="majorHAnsi" w:eastAsiaTheme="majorEastAsia" w:hAnsiTheme="majorHAnsi" w:cstheme="majorBidi"/>
+      <w:color w:val="0F4761" w:themeColor="accent1" w:themeShade="BF"/>
+      <w:sz w:val="32"/>
+      <w:szCs w:val="32"/>
+    </w:rPr>
+  </w:style>
+  <w:style w:type="character" w:customStyle="1" w:styleId="Heading3Char">
+    <w:name w:val="Heading 3 Char"/>
+    <w:basedOn w:val="DefaultParagraphFont"/>
+    <w:link w:val="Heading3"/>
+    <w:uiPriority w:val="9"/>
+    <w:semiHidden/>
+    <w:rsid w:val="00A10FD9"/>
+    <w:rPr>
+      <w:rFonts w:eastAsiaTheme="majorEastAsia" w:cstheme="majorBidi"/>
+      <w:color w:val="0F4761" w:themeColor="accent1" w:themeShade="BF"/>
+      <w:sz w:val="28"/>
+      <w:szCs w:val="28"/>
+    </w:rPr>
+  </w:style>
+  <w:style w:type="character" w:customStyle="1" w:styleId="Heading4Char">
+    <w:name w:val="Heading 4 Char"/>
+    <w:basedOn w:val="DefaultParagraphFont"/>
+    <w:link w:val="Heading4"/>
+    <w:uiPriority w:val="9"/>
+    <w:semiHidden/>
+    <w:rsid w:val="00A10FD9"/>
+    <w:rPr>
+      <w:rFonts w:eastAsiaTheme="majorEastAsia" w:cstheme="majorBidi"/>
+      <w:i/>
+      <w:iCs/>
+      <w:color w:val="0F4761" w:themeColor="accent1" w:themeShade="BF"/>
+    </w:rPr>
+  </w:style>
+  <w:style w:type="character" w:customStyle="1" w:styleId="Heading5Char">
+    <w:name w:val="Heading 5 Char"/>
+    <w:basedOn w:val="DefaultParagraphFont"/>
+    <w:link w:val="Heading5"/>
+    <w:uiPriority w:val="9"/>
+    <w:semiHidden/>
+    <w:rsid w:val="00A10FD9"/>
+    <w:rPr>
+      <w:rFonts w:eastAsiaTheme="majorEastAsia" w:cstheme="majorBidi"/>
+      <w:color w:val="0F4761" w:themeColor="accent1" w:themeShade="BF"/>
+    </w:rPr>
+  </w:style>
+  <w:style w:type="character" w:customStyle="1" w:styleId="Heading6Char">
+    <w:name w:val="Heading 6 Char"/>
+    <w:basedOn w:val="DefaultParagraphFont"/>
+    <w:link w:val="Heading6"/>
+    <w:uiPriority w:val="9"/>
+    <w:semiHidden/>
+    <w:rsid w:val="00A10FD9"/>
+    <w:rPr>
+      <w:rFonts w:eastAsiaTheme="majorEastAsia" w:cstheme="majorBidi"/>
+      <w:i/>
+      <w:iCs/>
+      <w:color w:val="595959" w:themeColor="text1" w:themeTint="A6"/>
+    </w:rPr>
+  </w:style>
+  <w:style w:type="character" w:customStyle="1" w:styleId="Heading7Char">
+    <w:name w:val="Heading 7 Char"/>
+    <w:basedOn w:val="DefaultParagraphFont"/>
+    <w:link w:val="Heading7"/>
+    <w:uiPriority w:val="9"/>
+    <w:semiHidden/>
+    <w:rsid w:val="00A10FD9"/>
+    <w:rPr>
+      <w:rFonts w:eastAsiaTheme="majorEastAsia" w:cstheme="majorBidi"/>
+      <w:color w:val="595959" w:themeColor="text1" w:themeTint="A6"/>
+    </w:rPr>
+  </w:style>
+  <w:style w:type="character" w:customStyle="1" w:styleId="Heading8Char">
+    <w:name w:val="Heading 8 Char"/>
+    <w:basedOn w:val="DefaultParagraphFont"/>
+    <w:link w:val="Heading8"/>
+    <w:uiPriority w:val="9"/>
+    <w:semiHidden/>
+    <w:rsid w:val="00A10FD9"/>
+    <w:rPr>
+      <w:rFonts w:eastAsiaTheme="majorEastAsia" w:cstheme="majorBidi"/>
+      <w:i/>
+      <w:iCs/>
+      <w:color w:val="272727" w:themeColor="text1" w:themeTint="D8"/>
+    </w:rPr>
+  </w:style>
+  <w:style w:type="character" w:customStyle="1" w:styleId="Heading9Char">
+    <w:name w:val="Heading 9 Char"/>
+    <w:basedOn w:val="DefaultParagraphFont"/>
+    <w:link w:val="Heading9"/>
+    <w:uiPriority w:val="9"/>
+    <w:semiHidden/>
+    <w:rsid w:val="00A10FD9"/>
+    <w:rPr>
+      <w:rFonts w:eastAsiaTheme="majorEastAsia" w:cstheme="majorBidi"/>
+      <w:color w:val="272727" w:themeColor="text1" w:themeTint="D8"/>
     </w:rPr>
   </w:style>
   <w:style w:type="paragraph" w:styleId="BlockText">
@@ -1016,6 +1146,18 @@
     <w:uiPriority w:val="9"/>
     <w:unhideWhenUsed/>
     <w:qFormat/>
+  </w:style>
+  <w:style w:type="paragraph" w:styleId="FootnoteBlockText">
+    <w:name w:val="Footnote Block Text"/>
+    <w:basedOn w:val="FootnoteText"/>
+    <w:next w:val="FootnoteText"/>
+    <w:uiPriority w:val="9"/>
+    <w:unhideWhenUsed/>
+    <w:qFormat/>
+    <w:pPr>
+      <w:spacing w:before="100" w:after="100"/>
+      <w:ind w:firstLine="0" w:left="480" w:right="480"/>
+    </w:pPr>
   </w:style>
   <w:style w:type="character" w:default="1" w:styleId="DefaultParagraphFont">
     <w:name w:val="Default Paragraph Font"/>
@@ -1037,6 +1179,14 @@
         <w:right w:w="108" w:type="dxa"/>
       </w:tblCellMar>
     </w:tblPr>
+    <w:tblStylePr w:type="firstRow">
+      <w:tcPr>
+        <w:tcBorders>
+          <w:bottom w:val="single"/>
+        </w:tcBorders>
+        <w:vAlign w:val="bottom"/>
+      </w:tcPr>
+    </w:tblStylePr>
   </w:style>
   <w:style w:type="paragraph" w:customStyle="1" w:styleId="DefinitionTerm">
     <w:name w:val="Definition Term"/>
@@ -1100,6 +1250,10 @@
       <w:rFonts w:ascii="Consolas" w:hAnsi="Consolas"/>
       <w:sz w:val="22"/>
     </w:rPr>
+  </w:style>
+  <w:style w:type="character" w:customStyle="1" w:styleId="SectionNumber">
+    <w:name w:val="Section Number"/>
+    <w:basedOn w:val="BodyTextChar"/>
   </w:style>
   <w:style w:type="character" w:styleId="FootnoteReference">
     <w:name w:val="Footnote Reference"/>
@@ -1147,44 +1301,44 @@
         <a:sysClr val="window" lastClr="FFFFFF"/>
       </a:lt1>
       <a:dk2>
-        <a:srgbClr val="1F497D"/>
+        <a:srgbClr val="0E2841"/>
       </a:dk2>
       <a:lt2>
-        <a:srgbClr val="EEECE1"/>
+        <a:srgbClr val="E8E8E8"/>
       </a:lt2>
       <a:accent1>
-        <a:srgbClr val="4F81BD"/>
+        <a:srgbClr val="156082"/>
       </a:accent1>
       <a:accent2>
-        <a:srgbClr val="C0504D"/>
+        <a:srgbClr val="E97132"/>
       </a:accent2>
       <a:accent3>
-        <a:srgbClr val="9BBB59"/>
+        <a:srgbClr val="196B24"/>
       </a:accent3>
       <a:accent4>
-        <a:srgbClr val="8064A2"/>
+        <a:srgbClr val="0F9ED5"/>
       </a:accent4>
       <a:accent5>
-        <a:srgbClr val="4BACC6"/>
+        <a:srgbClr val="A02B93"/>
       </a:accent5>
       <a:accent6>
-        <a:srgbClr val="F79646"/>
+        <a:srgbClr val="4EA72E"/>
       </a:accent6>
       <a:hlink>
-        <a:srgbClr val="0000FF"/>
+        <a:srgbClr val="467886"/>
       </a:hlink>
       <a:folHlink>
-        <a:srgbClr val="800080"/>
+        <a:srgbClr val="96607D"/>
       </a:folHlink>
     </a:clrScheme>
     <a:fontScheme name="Office">
       <a:majorFont>
-        <a:latin typeface="Calibri"/>
+        <a:latin typeface="Aptos Display" panose="02110004020202020204"/>
         <a:ea typeface=""/>
         <a:cs typeface=""/>
-        <a:font script="Jpan" typeface="ＭＳ ゴシック"/>
+        <a:font script="Jpan" typeface="游ゴシック Light"/>
         <a:font script="Hang" typeface="맑은 고딕"/>
-        <a:font script="Hans" typeface="宋体"/>
+        <a:font script="Hans" typeface="等线 Light"/>
         <a:font script="Hant" typeface="新細明體"/>
         <a:font script="Arab" typeface="Times New Roman"/>
         <a:font script="Hebr" typeface="Times New Roman"/>
@@ -1211,14 +1365,32 @@
         <a:font script="Mong" typeface="Mongolian Baiti"/>
         <a:font script="Viet" typeface="Times New Roman"/>
         <a:font script="Uigh" typeface="Microsoft Uighur"/>
+        <a:font script="Geor" typeface="Sylfaen"/>
+        <a:font script="Armn" typeface="Arial"/>
+        <a:font script="Bugi" typeface="Leelawadee UI"/>
+        <a:font script="Bopo" typeface="Microsoft JhengHei"/>
+        <a:font script="Java" typeface="Javanese Text"/>
+        <a:font script="Lisu" typeface="Segoe UI"/>
+        <a:font script="Mymr" typeface="Myanmar Text"/>
+        <a:font script="Nkoo" typeface="Ebrima"/>
+        <a:font script="Olck" typeface="Nirmala UI"/>
+        <a:font script="Osma" typeface="Ebrima"/>
+        <a:font script="Phag" typeface="Phagspa"/>
+        <a:font script="Syrn" typeface="Estrangelo Edessa"/>
+        <a:font script="Syrj" typeface="Estrangelo Edessa"/>
+        <a:font script="Syre" typeface="Estrangelo Edessa"/>
+        <a:font script="Sora" typeface="Nirmala UI"/>
+        <a:font script="Tale" typeface="Microsoft Tai Le"/>
+        <a:font script="Talu" typeface="Microsoft New Tai Lue"/>
+        <a:font script="Tfng" typeface="Ebrima"/>
       </a:majorFont>
       <a:minorFont>
-        <a:latin typeface="Cambria"/>
+        <a:latin typeface="Aptos" panose="02110004020202020204"/>
         <a:ea typeface=""/>
         <a:cs typeface=""/>
-        <a:font script="Jpan" typeface="ＭＳ 明朝"/>
+        <a:font script="Jpan" typeface="游明朝"/>
         <a:font script="Hang" typeface="맑은 고딕"/>
-        <a:font script="Hans" typeface="宋体"/>
+        <a:font script="Hans" typeface="等线"/>
         <a:font script="Hant" typeface="新細明體"/>
         <a:font script="Arab" typeface="Arial"/>
         <a:font script="Hebr" typeface="Arial"/>
@@ -1245,6 +1417,24 @@
         <a:font script="Mong" typeface="Mongolian Baiti"/>
         <a:font script="Viet" typeface="Arial"/>
         <a:font script="Uigh" typeface="Microsoft Uighur"/>
+        <a:font script="Geor" typeface="Sylfaen"/>
+        <a:font script="Armn" typeface="Arial"/>
+        <a:font script="Bugi" typeface="Leelawadee UI"/>
+        <a:font script="Bopo" typeface="Microsoft JhengHei"/>
+        <a:font script="Java" typeface="Javanese Text"/>
+        <a:font script="Lisu" typeface="Segoe UI"/>
+        <a:font script="Mymr" typeface="Myanmar Text"/>
+        <a:font script="Nkoo" typeface="Ebrima"/>
+        <a:font script="Olck" typeface="Nirmala UI"/>
+        <a:font script="Osma" typeface="Ebrima"/>
+        <a:font script="Phag" typeface="Phagspa"/>
+        <a:font script="Syrn" typeface="Estrangelo Edessa"/>
+        <a:font script="Syrj" typeface="Estrangelo Edessa"/>
+        <a:font script="Syre" typeface="Estrangelo Edessa"/>
+        <a:font script="Sora" typeface="Nirmala UI"/>
+        <a:font script="Tale" typeface="Microsoft Tai Le"/>
+        <a:font script="Talu" typeface="Microsoft New Tai Lue"/>
+        <a:font script="Tfng" typeface="Ebrima"/>
       </a:minorFont>
     </a:fontScheme>
     <a:fmtScheme name="Office">
@@ -1256,200 +1446,141 @@
           <a:gsLst>
             <a:gs pos="0">
               <a:schemeClr val="phClr">
-                <a:tint val="50000"/>
-                <a:satMod val="300000"/>
+                <a:lumMod val="110000"/>
+                <a:satMod val="105000"/>
+                <a:tint val="67000"/>
               </a:schemeClr>
             </a:gs>
-            <a:gs pos="35000">
+            <a:gs pos="50000">
               <a:schemeClr val="phClr">
-                <a:tint val="37000"/>
-                <a:satMod val="300000"/>
+                <a:lumMod val="105000"/>
+                <a:satMod val="103000"/>
+                <a:tint val="73000"/>
               </a:schemeClr>
             </a:gs>
             <a:gs pos="100000">
               <a:schemeClr val="phClr">
-                <a:tint val="15000"/>
-                <a:satMod val="350000"/>
+                <a:lumMod val="105000"/>
+                <a:satMod val="109000"/>
+                <a:tint val="81000"/>
               </a:schemeClr>
             </a:gs>
           </a:gsLst>
-          <a:lin ang="16200000" scaled="1"/>
+          <a:lin ang="5400000" scaled="0"/>
         </a:gradFill>
         <a:gradFill rotWithShape="1">
           <a:gsLst>
             <a:gs pos="0">
               <a:schemeClr val="phClr">
-                <a:tint val="100000"/>
+                <a:satMod val="103000"/>
+                <a:lumMod val="102000"/>
+                <a:tint val="94000"/>
+              </a:schemeClr>
+            </a:gs>
+            <a:gs pos="50000">
+              <a:schemeClr val="phClr">
+                <a:satMod val="110000"/>
+                <a:lumMod val="100000"/>
                 <a:shade val="100000"/>
-                <a:satMod val="130000"/>
               </a:schemeClr>
             </a:gs>
             <a:gs pos="100000">
               <a:schemeClr val="phClr">
-                <a:tint val="50000"/>
-                <a:shade val="100000"/>
-                <a:satMod val="350000"/>
+                <a:lumMod val="99000"/>
+                <a:satMod val="120000"/>
+                <a:shade val="78000"/>
               </a:schemeClr>
             </a:gs>
           </a:gsLst>
-          <a:lin ang="16200000" scaled="0"/>
+          <a:lin ang="5400000" scaled="0"/>
         </a:gradFill>
       </a:fillStyleLst>
       <a:lnStyleLst>
-        <a:ln w="9525" cap="flat" cmpd="sng" algn="ctr">
-          <a:solidFill>
-            <a:schemeClr val="phClr">
-              <a:shade val="95000"/>
-              <a:satMod val="105000"/>
-            </a:schemeClr>
-          </a:solidFill>
-          <a:prstDash val="solid"/>
-        </a:ln>
-        <a:ln w="25400" cap="flat" cmpd="sng" algn="ctr">
+        <a:ln w="6350" cap="flat" cmpd="sng" algn="ctr">
           <a:solidFill>
             <a:schemeClr val="phClr"/>
           </a:solidFill>
           <a:prstDash val="solid"/>
+          <a:miter lim="800000"/>
         </a:ln>
-        <a:ln w="38100" cap="flat" cmpd="sng" algn="ctr">
+        <a:ln w="12700" cap="flat" cmpd="sng" algn="ctr">
           <a:solidFill>
             <a:schemeClr val="phClr"/>
           </a:solidFill>
           <a:prstDash val="solid"/>
+          <a:miter lim="800000"/>
+        </a:ln>
+        <a:ln w="19050" cap="flat" cmpd="sng" algn="ctr">
+          <a:solidFill>
+            <a:schemeClr val="phClr"/>
+          </a:solidFill>
+          <a:prstDash val="solid"/>
+          <a:miter lim="800000"/>
         </a:ln>
       </a:lnStyleLst>
       <a:effectStyleLst>
         <a:effectStyle>
+          <a:effectLst/>
+        </a:effectStyle>
+        <a:effectStyle>
+          <a:effectLst/>
+        </a:effectStyle>
+        <a:effectStyle>
           <a:effectLst>
-            <a:outerShdw blurRad="40000" dist="20000" dir="5400000" rotWithShape="0">
+            <a:outerShdw blurRad="57150" dist="19050" dir="5400000" algn="ctr" rotWithShape="0">
               <a:srgbClr val="000000">
-                <a:alpha val="38000"/>
+                <a:alpha val="63000"/>
               </a:srgbClr>
             </a:outerShdw>
           </a:effectLst>
-        </a:effectStyle>
-        <a:effectStyle>
-          <a:effectLst>
-            <a:outerShdw blurRad="40000" dist="23000" dir="5400000" rotWithShape="0">
-              <a:srgbClr val="000000">
-                <a:alpha val="35000"/>
-              </a:srgbClr>
-            </a:outerShdw>
-          </a:effectLst>
-        </a:effectStyle>
-        <a:effectStyle>
-          <a:effectLst>
-            <a:outerShdw blurRad="40000" dist="23000" dir="5400000" rotWithShape="0">
-              <a:srgbClr val="000000">
-                <a:alpha val="35000"/>
-              </a:srgbClr>
-            </a:outerShdw>
-          </a:effectLst>
-          <a:scene3d>
-            <a:camera prst="orthographicFront">
-              <a:rot lat="0" lon="0" rev="0"/>
-            </a:camera>
-            <a:lightRig rig="threePt" dir="t">
-              <a:rot lat="0" lon="0" rev="1200000"/>
-            </a:lightRig>
-          </a:scene3d>
-          <a:sp3d>
-            <a:bevelT w="63500" h="25400"/>
-          </a:sp3d>
         </a:effectStyle>
       </a:effectStyleLst>
       <a:bgFillStyleLst>
         <a:solidFill>
           <a:schemeClr val="phClr"/>
         </a:solidFill>
+        <a:solidFill>
+          <a:schemeClr val="phClr">
+            <a:tint val="95000"/>
+            <a:satMod val="170000"/>
+          </a:schemeClr>
+        </a:solidFill>
         <a:gradFill rotWithShape="1">
           <a:gsLst>
             <a:gs pos="0">
               <a:schemeClr val="phClr">
-                <a:tint val="40000"/>
-                <a:satMod val="350000"/>
+                <a:tint val="93000"/>
+                <a:satMod val="150000"/>
+                <a:shade val="98000"/>
+                <a:lumMod val="102000"/>
               </a:schemeClr>
             </a:gs>
-            <a:gs pos="40000">
+            <a:gs pos="50000">
               <a:schemeClr val="phClr">
-                <a:tint val="45000"/>
-                <a:shade val="99000"/>
-                <a:satMod val="350000"/>
+                <a:tint val="98000"/>
+                <a:satMod val="130000"/>
+                <a:shade val="90000"/>
+                <a:lumMod val="103000"/>
               </a:schemeClr>
             </a:gs>
             <a:gs pos="100000">
               <a:schemeClr val="phClr">
-                <a:shade val="20000"/>
-                <a:satMod val="255000"/>
+                <a:shade val="63000"/>
+                <a:satMod val="120000"/>
               </a:schemeClr>
             </a:gs>
           </a:gsLst>
-          <a:path path="circle">
-            <a:fillToRect l="50000" t="-80000" r="50000" b="180000"/>
-          </a:path>
-        </a:gradFill>
-        <a:gradFill rotWithShape="1">
-          <a:gsLst>
-            <a:gs pos="0">
-              <a:schemeClr val="phClr">
-                <a:tint val="80000"/>
-                <a:satMod val="300000"/>
-              </a:schemeClr>
-            </a:gs>
-            <a:gs pos="100000">
-              <a:schemeClr val="phClr">
-                <a:shade val="30000"/>
-                <a:satMod val="200000"/>
-              </a:schemeClr>
-            </a:gs>
-          </a:gsLst>
-          <a:path path="circle">
-            <a:fillToRect l="50000" t="50000" r="50000" b="50000"/>
-          </a:path>
+          <a:lin ang="5400000" scaled="0"/>
         </a:gradFill>
       </a:bgFillStyleLst>
     </a:fmtScheme>
   </a:themeElements>
-  <a:objectDefaults>
-    <a:spDef>
-      <a:spPr/>
-      <a:bodyPr/>
-      <a:lstStyle/>
-      <a:style>
-        <a:lnRef idx="1">
-          <a:schemeClr val="accent1"/>
-        </a:lnRef>
-        <a:fillRef idx="3">
-          <a:schemeClr val="accent1"/>
-        </a:fillRef>
-        <a:effectRef idx="2">
-          <a:schemeClr val="accent1"/>
-        </a:effectRef>
-        <a:fontRef idx="minor">
-          <a:schemeClr val="lt1"/>
-        </a:fontRef>
-      </a:style>
-    </a:spDef>
-    <a:lnDef>
-      <a:spPr/>
-      <a:bodyPr/>
-      <a:lstStyle/>
-      <a:style>
-        <a:lnRef idx="2">
-          <a:schemeClr val="accent1"/>
-        </a:lnRef>
-        <a:fillRef idx="0">
-          <a:schemeClr val="accent1"/>
-        </a:fillRef>
-        <a:effectRef idx="1">
-          <a:schemeClr val="accent1"/>
-        </a:effectRef>
-        <a:fontRef idx="minor">
-          <a:schemeClr val="tx1"/>
-        </a:fontRef>
-      </a:style>
-    </a:lnDef>
-  </a:objectDefaults>
+  <a:objectDefaults/>
   <a:extraClrSchemeLst/>
+  <a:extLst>
+    <a:ext uri="{05A4C25C-085E-4340-85A3-A5531E510DB2}">
+      <thm15:themeFamily xmlns:thm15="http://schemas.microsoft.com/office/thememl/2012/main" name="Office Theme" id="{2E142A2C-CD16-42D6-873A-C26D2A0506FA}" vid="{1BDDFF52-6CD6-40A5-AB3C-68EB2F1E4D0A}"/>
+    </a:ext>
+  </a:extLst>
 </a:theme>
 </file>
</xml_diff>